<commit_message>
expand Middle East crisis note: add background, coping mechanisms, fuller distributions (~3pp)
</commit_message>
<xml_diff>
--- a/CATI/Analysis/SL/L2PHL_CATI_MiddleEast_Crisis_Note_Jun2026.docx
+++ b/CATI/Analysis/SL/L2PHL_CATI_MiddleEast_Crisis_Note_Jun2026.docx
@@ -27,7 +27,7 @@
           <w:sz w:val="16"/>
           <w:szCs w:val="16"/>
         </w:rPr>
-        <w:t xml:space="preserve">Crisis note · June 2026</w:t>
+        <w:t xml:space="preserve">Crisis note · Preliminary (v1) · June 2026</w:t>
       </w:r>
     </w:p>
     <w:p>
@@ -113,7 +113,7 @@
           <w:sz w:val="20"/>
           <w:szCs w:val="20"/>
         </w:rPr>
-        <w:t xml:space="preserve"> perceive a moderate or severe impact on the Philippines. The channels households name are overwhelmingly prices — fuel, other goods, and food — rather than jobs or remittances. About </w:t>
+        <w:t xml:space="preserve"> perceive a moderate or severe impact on the Philippines. The channels they name are overwhelmingly prices — fuel, other goods, and food — rather than jobs or remittances. About </w:t>
       </w:r>
       <w:r>
         <w:rPr>
@@ -129,7 +129,27 @@
           <w:sz w:val="20"/>
           <w:szCs w:val="20"/>
         </w:rPr>
-        <w:t xml:space="preserve"> felt prices rising faster than usual, although their expectations for the month ahead eased between Round 6 and Round 7. Confidence in the government response is limited: only about one in four agree it is doing enough.</w:t>
+        <w:t xml:space="preserve"> felt prices rising faster than usual, though their expectations for the month ahead eased between Round 6 and Round 7. Confidence in the public response is limited: only about one in four agree the government is doing enough, and households facing recent shocks lean mostly on family rather than formal support.</w:t>
+      </w:r>
+    </w:p>
+    <w:p>
+      <w:pPr>
+        <w:pStyle w:val="Heading2"/>
+      </w:pPr>
+      <w:r>
+        <w:t xml:space="preserve">Background</w:t>
+      </w:r>
+    </w:p>
+    <w:p>
+      <w:pPr>
+        <w:spacing w:after="120"/>
+      </w:pPr>
+      <w:r>
+        <w:rPr>
+          <w:sz w:val="20"/>
+          <w:szCs w:val="20"/>
+        </w:rPr>
+        <w:t xml:space="preserve">Heightened conflict and tension in the Middle East through 2025–26 raised global concern about energy prices, shipping routes, and the situation of migrant workers in the region. The Philippines is exposed on two main fronts: as a net importer of fuel and energy, where world price movements pass quickly into domestic prices, and as a major origin country for overseas Filipino workers (OFWs) in the Gulf, whose employment and remittances could be disrupted. To track how households read this risk, the Listening to the Philippines (L2PHL) panel added six rapid-response questions to its monthly phone survey beginning in Round 6 (April 2026) and repeated them in Round 7 (May 2026). L2PHL is a nationally representative panel that re-interviews households from the 2025 baseline; this note draws on the households that answered the new questions in those two rounds.</w:t>
       </w:r>
     </w:p>
     <w:p>
@@ -290,7 +310,7 @@
                 <w:sz w:val="18"/>
                 <w:szCs w:val="18"/>
               </w:rPr>
-              <w:t xml:space="preserve">Change</w:t>
+              <w:t xml:space="preserve">Change (ppt)</w:t>
             </w:r>
           </w:p>
         </w:tc>
@@ -727,7 +747,7 @@
                 <w:sz w:val="18"/>
                 <w:szCs w:val="18"/>
               </w:rPr>
-              <w:t xml:space="preserve">Felt prices rise faster than usual (past 30 days)</w:t>
+              <w:t xml:space="preserve">   of which: severe impact</w:t>
             </w:r>
           </w:p>
         </w:tc>
@@ -760,7 +780,7 @@
                 <w:sz w:val="18"/>
                 <w:szCs w:val="18"/>
               </w:rPr>
-              <w:t xml:space="preserve">86.9%</w:t>
+              <w:t xml:space="preserve">69.3%</w:t>
             </w:r>
           </w:p>
         </w:tc>
@@ -793,7 +813,7 @@
                 <w:sz w:val="18"/>
                 <w:szCs w:val="18"/>
               </w:rPr>
-              <w:t xml:space="preserve">85.2%</w:t>
+              <w:t xml:space="preserve">65.2%</w:t>
             </w:r>
           </w:p>
         </w:tc>
@@ -822,11 +842,11 @@
               <w:rPr>
                 <w:b w:val="false"/>
                 <w:bCs w:val="false"/>
-                <w:color w:val="555555"/>
-                <w:sz w:val="18"/>
-                <w:szCs w:val="18"/>
-              </w:rPr>
-              <w:t xml:space="preserve">−1.7</w:t>
+                <w:color w:val="CE1126"/>
+                <w:sz w:val="18"/>
+                <w:szCs w:val="18"/>
+              </w:rPr>
+              <w:t xml:space="preserve">−4.2</w:t>
             </w:r>
           </w:p>
         </w:tc>
@@ -861,7 +881,7 @@
                 <w:sz w:val="18"/>
                 <w:szCs w:val="18"/>
               </w:rPr>
-              <w:t xml:space="preserve">Expect prices to rise faster (next 30 days)</w:t>
+              <w:t xml:space="preserve">Felt prices rise faster than usual (past 30 days)</w:t>
             </w:r>
           </w:p>
         </w:tc>
@@ -894,7 +914,7 @@
                 <w:sz w:val="18"/>
                 <w:szCs w:val="18"/>
               </w:rPr>
-              <w:t xml:space="preserve">80.0%</w:t>
+              <w:t xml:space="preserve">86.9%</w:t>
             </w:r>
           </w:p>
         </w:tc>
@@ -927,7 +947,7 @@
                 <w:sz w:val="18"/>
                 <w:szCs w:val="18"/>
               </w:rPr>
-              <w:t xml:space="preserve">68.0%</w:t>
+              <w:t xml:space="preserve">85.2%</w:t>
             </w:r>
           </w:p>
         </w:tc>
@@ -956,11 +976,11 @@
               <w:rPr>
                 <w:b w:val="false"/>
                 <w:bCs w:val="false"/>
-                <w:color w:val="CE1126"/>
-                <w:sz w:val="18"/>
-                <w:szCs w:val="18"/>
-              </w:rPr>
-              <w:t xml:space="preserve">−12.1</w:t>
+                <w:color w:val="555555"/>
+                <w:sz w:val="18"/>
+                <w:szCs w:val="18"/>
+              </w:rPr>
+              <w:t xml:space="preserve">−1.7</w:t>
             </w:r>
           </w:p>
         </w:tc>
@@ -995,7 +1015,275 @@
                 <w:sz w:val="18"/>
                 <w:szCs w:val="18"/>
               </w:rPr>
-              <w:t xml:space="preserve">Agree the government is doing enough to respond</w:t>
+              <w:t xml:space="preserve">Expect prices to rise faster (next 30 days)</w:t>
+            </w:r>
+          </w:p>
+        </w:tc>
+        <w:tc>
+          <w:tcPr>
+            <w:tcW w:type="dxa" w:w="1800"/>
+            <w:tcBorders>
+              <w:top w:val="single" w:color="CCCCCC" w:sz="1"/>
+              <w:left w:val="single" w:color="CCCCCC" w:sz="1"/>
+              <w:bottom w:val="single" w:color="CCCCCC" w:sz="1"/>
+              <w:right w:val="single" w:color="CCCCCC" w:sz="1"/>
+            </w:tcBorders>
+            <w:shd w:fill="F2F6F9" w:val="clear"/>
+            <w:tcMar>
+              <w:top w:type="dxa" w:w="60"/>
+              <w:left w:type="dxa" w:w="120"/>
+              <w:bottom w:type="dxa" w:w="60"/>
+              <w:right w:type="dxa" w:w="120"/>
+            </w:tcMar>
+          </w:tcPr>
+          <w:p>
+            <w:pPr>
+              <w:jc w:val="center"/>
+            </w:pPr>
+            <w:r>
+              <w:rPr>
+                <w:b w:val="false"/>
+                <w:bCs w:val="false"/>
+                <w:color w:val="000000"/>
+                <w:sz w:val="18"/>
+                <w:szCs w:val="18"/>
+              </w:rPr>
+              <w:t xml:space="preserve">80.0%</w:t>
+            </w:r>
+          </w:p>
+        </w:tc>
+        <w:tc>
+          <w:tcPr>
+            <w:tcW w:type="dxa" w:w="1800"/>
+            <w:tcBorders>
+              <w:top w:val="single" w:color="CCCCCC" w:sz="1"/>
+              <w:left w:val="single" w:color="CCCCCC" w:sz="1"/>
+              <w:bottom w:val="single" w:color="CCCCCC" w:sz="1"/>
+              <w:right w:val="single" w:color="CCCCCC" w:sz="1"/>
+            </w:tcBorders>
+            <w:shd w:fill="F2F6F9" w:val="clear"/>
+            <w:tcMar>
+              <w:top w:type="dxa" w:w="60"/>
+              <w:left w:type="dxa" w:w="120"/>
+              <w:bottom w:type="dxa" w:w="60"/>
+              <w:right w:type="dxa" w:w="120"/>
+            </w:tcMar>
+          </w:tcPr>
+          <w:p>
+            <w:pPr>
+              <w:jc w:val="center"/>
+            </w:pPr>
+            <w:r>
+              <w:rPr>
+                <w:b w:val="false"/>
+                <w:bCs w:val="false"/>
+                <w:color w:val="000000"/>
+                <w:sz w:val="18"/>
+                <w:szCs w:val="18"/>
+              </w:rPr>
+              <w:t xml:space="preserve">68.0%</w:t>
+            </w:r>
+          </w:p>
+        </w:tc>
+        <w:tc>
+          <w:tcPr>
+            <w:tcW w:type="dxa" w:w="1800"/>
+            <w:tcBorders>
+              <w:top w:val="single" w:color="CCCCCC" w:sz="1"/>
+              <w:left w:val="single" w:color="CCCCCC" w:sz="1"/>
+              <w:bottom w:val="single" w:color="CCCCCC" w:sz="1"/>
+              <w:right w:val="single" w:color="CCCCCC" w:sz="1"/>
+            </w:tcBorders>
+            <w:shd w:fill="F2F6F9" w:val="clear"/>
+            <w:tcMar>
+              <w:top w:type="dxa" w:w="60"/>
+              <w:left w:type="dxa" w:w="120"/>
+              <w:bottom w:type="dxa" w:w="60"/>
+              <w:right w:type="dxa" w:w="120"/>
+            </w:tcMar>
+          </w:tcPr>
+          <w:p>
+            <w:pPr>
+              <w:jc w:val="center"/>
+            </w:pPr>
+            <w:r>
+              <w:rPr>
+                <w:b w:val="false"/>
+                <w:bCs w:val="false"/>
+                <w:color w:val="CE1126"/>
+                <w:sz w:val="18"/>
+                <w:szCs w:val="18"/>
+              </w:rPr>
+              <w:t xml:space="preserve">−12.1</w:t>
+            </w:r>
+          </w:p>
+        </w:tc>
+      </w:tr>
+      <w:tr>
+        <w:tc>
+          <w:tcPr>
+            <w:tcW w:type="dxa" w:w="3960"/>
+            <w:tcBorders>
+              <w:top w:val="single" w:color="CCCCCC" w:sz="1"/>
+              <w:left w:val="single" w:color="CCCCCC" w:sz="1"/>
+              <w:bottom w:val="single" w:color="CCCCCC" w:sz="1"/>
+              <w:right w:val="single" w:color="CCCCCC" w:sz="1"/>
+            </w:tcBorders>
+            <w:shd w:fill="FFFFFF" w:val="clear"/>
+            <w:tcMar>
+              <w:top w:type="dxa" w:w="60"/>
+              <w:left w:type="dxa" w:w="120"/>
+              <w:bottom w:type="dxa" w:w="60"/>
+              <w:right w:type="dxa" w:w="120"/>
+            </w:tcMar>
+          </w:tcPr>
+          <w:p>
+            <w:pPr>
+              <w:jc w:val="left"/>
+            </w:pPr>
+            <w:r>
+              <w:rPr>
+                <w:b w:val="false"/>
+                <w:bCs w:val="false"/>
+                <w:color w:val="000000"/>
+                <w:sz w:val="18"/>
+                <w:szCs w:val="18"/>
+              </w:rPr>
+              <w:t xml:space="preserve">Disagree the government is doing enough</w:t>
+            </w:r>
+          </w:p>
+        </w:tc>
+        <w:tc>
+          <w:tcPr>
+            <w:tcW w:type="dxa" w:w="1800"/>
+            <w:tcBorders>
+              <w:top w:val="single" w:color="CCCCCC" w:sz="1"/>
+              <w:left w:val="single" w:color="CCCCCC" w:sz="1"/>
+              <w:bottom w:val="single" w:color="CCCCCC" w:sz="1"/>
+              <w:right w:val="single" w:color="CCCCCC" w:sz="1"/>
+            </w:tcBorders>
+            <w:shd w:fill="FFFFFF" w:val="clear"/>
+            <w:tcMar>
+              <w:top w:type="dxa" w:w="60"/>
+              <w:left w:type="dxa" w:w="120"/>
+              <w:bottom w:type="dxa" w:w="60"/>
+              <w:right w:type="dxa" w:w="120"/>
+            </w:tcMar>
+          </w:tcPr>
+          <w:p>
+            <w:pPr>
+              <w:jc w:val="center"/>
+            </w:pPr>
+            <w:r>
+              <w:rPr>
+                <w:b w:val="false"/>
+                <w:bCs w:val="false"/>
+                <w:color w:val="000000"/>
+                <w:sz w:val="18"/>
+                <w:szCs w:val="18"/>
+              </w:rPr>
+              <w:t xml:space="preserve">49.3%</w:t>
+            </w:r>
+          </w:p>
+        </w:tc>
+        <w:tc>
+          <w:tcPr>
+            <w:tcW w:type="dxa" w:w="1800"/>
+            <w:tcBorders>
+              <w:top w:val="single" w:color="CCCCCC" w:sz="1"/>
+              <w:left w:val="single" w:color="CCCCCC" w:sz="1"/>
+              <w:bottom w:val="single" w:color="CCCCCC" w:sz="1"/>
+              <w:right w:val="single" w:color="CCCCCC" w:sz="1"/>
+            </w:tcBorders>
+            <w:shd w:fill="FFFFFF" w:val="clear"/>
+            <w:tcMar>
+              <w:top w:type="dxa" w:w="60"/>
+              <w:left w:type="dxa" w:w="120"/>
+              <w:bottom w:type="dxa" w:w="60"/>
+              <w:right w:type="dxa" w:w="120"/>
+            </w:tcMar>
+          </w:tcPr>
+          <w:p>
+            <w:pPr>
+              <w:jc w:val="center"/>
+            </w:pPr>
+            <w:r>
+              <w:rPr>
+                <w:b w:val="false"/>
+                <w:bCs w:val="false"/>
+                <w:color w:val="000000"/>
+                <w:sz w:val="18"/>
+                <w:szCs w:val="18"/>
+              </w:rPr>
+              <w:t xml:space="preserve">45.7%</w:t>
+            </w:r>
+          </w:p>
+        </w:tc>
+        <w:tc>
+          <w:tcPr>
+            <w:tcW w:type="dxa" w:w="1800"/>
+            <w:tcBorders>
+              <w:top w:val="single" w:color="CCCCCC" w:sz="1"/>
+              <w:left w:val="single" w:color="CCCCCC" w:sz="1"/>
+              <w:bottom w:val="single" w:color="CCCCCC" w:sz="1"/>
+              <w:right w:val="single" w:color="CCCCCC" w:sz="1"/>
+            </w:tcBorders>
+            <w:shd w:fill="FFFFFF" w:val="clear"/>
+            <w:tcMar>
+              <w:top w:type="dxa" w:w="60"/>
+              <w:left w:type="dxa" w:w="120"/>
+              <w:bottom w:type="dxa" w:w="60"/>
+              <w:right w:type="dxa" w:w="120"/>
+            </w:tcMar>
+          </w:tcPr>
+          <w:p>
+            <w:pPr>
+              <w:jc w:val="center"/>
+            </w:pPr>
+            <w:r>
+              <w:rPr>
+                <w:b w:val="false"/>
+                <w:bCs w:val="false"/>
+                <w:color w:val="CE1126"/>
+                <w:sz w:val="18"/>
+                <w:szCs w:val="18"/>
+              </w:rPr>
+              <w:t xml:space="preserve">−3.6</w:t>
+            </w:r>
+          </w:p>
+        </w:tc>
+      </w:tr>
+      <w:tr>
+        <w:tc>
+          <w:tcPr>
+            <w:tcW w:type="dxa" w:w="3960"/>
+            <w:tcBorders>
+              <w:top w:val="single" w:color="CCCCCC" w:sz="1"/>
+              <w:left w:val="single" w:color="CCCCCC" w:sz="1"/>
+              <w:bottom w:val="single" w:color="CCCCCC" w:sz="1"/>
+              <w:right w:val="single" w:color="CCCCCC" w:sz="1"/>
+            </w:tcBorders>
+            <w:shd w:fill="F2F6F9" w:val="clear"/>
+            <w:tcMar>
+              <w:top w:type="dxa" w:w="60"/>
+              <w:left w:type="dxa" w:w="120"/>
+              <w:bottom w:type="dxa" w:w="60"/>
+              <w:right w:type="dxa" w:w="120"/>
+            </w:tcMar>
+          </w:tcPr>
+          <w:p>
+            <w:pPr>
+              <w:jc w:val="left"/>
+            </w:pPr>
+            <w:r>
+              <w:rPr>
+                <w:b w:val="false"/>
+                <w:bCs w:val="false"/>
+                <w:color w:val="000000"/>
+                <w:sz w:val="18"/>
+                <w:szCs w:val="18"/>
+              </w:rPr>
+              <w:t xml:space="preserve">Agree the government is doing enough</w:t>
             </w:r>
           </w:p>
         </w:tc>
@@ -1111,14 +1399,34 @@
           <w:sz w:val="20"/>
           <w:szCs w:val="20"/>
         </w:rPr>
-        <w:t xml:space="preserve">Households read the crisis through the cost of living. </w:t>
+        <w:t xml:space="preserve">Concern is both wide and deep. </w:t>
       </w:r>
       <w:r>
         <w:rPr>
           <w:sz w:val="20"/>
           <w:szCs w:val="20"/>
         </w:rPr>
-        <w:t xml:space="preserve">Asked for the single most important channel of impact, they point almost entirely to prices: fuel and energy (35.3 percent), other goods (34.1 percent), and food (19.7 percent). Labor-market and remittance channels — the routes through which a Middle East shock most directly reaches the Philippines — are named by barely 1 percent each.</w:t>
+        <w:t xml:space="preserve">Across the two rounds, more than nine in ten households are at least somewhat concerned, and around half describe themselves as very concerned. Perceived impact on the country is similarly high, with about two-thirds calling it severe. These shares barely moved between Round 6 and Round 7, indicating a settled, broad-based anxiety rather than a passing reaction.</w:t>
+      </w:r>
+    </w:p>
+    <w:p>
+      <w:pPr>
+        <w:pStyle w:val="Heading2"/>
+      </w:pPr>
+      <w:r>
+        <w:t xml:space="preserve">Households read the crisis through the cost of living</w:t>
+      </w:r>
+    </w:p>
+    <w:p>
+      <w:pPr>
+        <w:spacing w:after="120"/>
+      </w:pPr>
+      <w:r>
+        <w:rPr>
+          <w:sz w:val="20"/>
+          <w:szCs w:val="20"/>
+        </w:rPr>
+        <w:t xml:space="preserve">Asked for the single most important channel of impact, households point almost entirely to prices: fuel and energy, other goods, and food together account for roughly 89 percent of first-ranked responses. The labor-market and remittance channels — the routes through which a Middle East shock most directly reaches the Philippine economy — are named by barely 1 percent each. Households therefore frame the crisis as a domestic cost-of-living problem, not as a threat to overseas jobs or transfers.</w:t>
       </w:r>
     </w:p>
     <w:tbl>
@@ -1170,7 +1478,7 @@
                 <w:sz w:val="18"/>
                 <w:szCs w:val="18"/>
               </w:rPr>
-              <w:t xml:space="preserve">Most-cited channel of impact (top-ranked)</w:t>
+              <w:t xml:space="preserve">Single most important channel of impact (top-ranked)</w:t>
             </w:r>
           </w:p>
         </w:tc>
@@ -1566,7 +1874,7 @@
           <w:sz w:val="20"/>
           <w:szCs w:val="20"/>
         </w:rPr>
-        <w:t xml:space="preserve">Felt inflation is broad and stable: 86.9 percent of households in Round 6 and 85.2 percent in Round 7 say prices rose faster than usual over the past 30 days. Expectations, however, softened — the share expecting prices to keep rising faster over the next 30 days fell from 80.0 percent to 68.0 percent between the two rounds, while the shares expecting a typical or slower pace both rose. This is a tentative sign that the initial price scare may be receding, even as the level of felt inflation remains elevated.</w:t>
+        <w:t xml:space="preserve">Felt inflation is broad and stable: 86.9 percent of households in Round 6 and 85.2 percent in Round 7 say prices rose faster than usual over the past 30 days. Expectations, however, softened — the share expecting prices to keep rising faster over the next 30 days fell from 80.0 to 68.0 percent between the two rounds, while the shares expecting a typical or slower pace both rose. This is a tentative sign that the initial price scare may be receding, even as the level of felt inflation remains elevated.</w:t>
       </w:r>
     </w:p>
     <w:p>
@@ -1574,19 +1882,680 @@
         <w:pStyle w:val="Heading2"/>
       </w:pPr>
       <w:r>
-        <w:t xml:space="preserve">Low confidence in the public response</w:t>
+        <w:t xml:space="preserve">How households are coping</w:t>
       </w:r>
     </w:p>
     <w:p>
       <w:pPr>
         <w:spacing w:after="120"/>
       </w:pPr>
+      <w:r>
+        <w:rPr>
+          <w:b/>
+          <w:bCs/>
+          <w:sz w:val="20"/>
+          <w:szCs w:val="20"/>
+        </w:rPr>
+        <w:t xml:space="preserve">Among households that reported a recent shock, coping relies heavily on informal networks. </w:t>
+      </w:r>
       <w:r>
         <w:rPr>
           <w:sz w:val="20"/>
           <w:szCs w:val="20"/>
         </w:rPr>
-        <w:t xml:space="preserve">Households are skeptical that the government is doing enough: about half disagree (49.3 percent in Round 6, 45.7 percent in Round 7) and only around a quarter agree (24.6 and 25.5 percent), with the remainder neutral. Because the crisis registers mainly through prices, its household-welfare consequences will track domestic fuel and food prices rather than labor-market or remittance disruptions, and the low share agreeing the response is adequate suggests room for clearer public communication on price and energy measures.</w:t>
+        <w:t xml:space="preserve">Borrowing from and receiving help from friends and family together account for more than 40 percent of coping responses, and about one in ten households reduced or shifted to cheaper food. Formal channels are thin: government assistance (7.2 percent) and loans from financial institutions (2.5 percent) are used by relatively few. The pattern suggests that, faced with rising prices, many households absorb the pressure through family support and consumption cuts rather than through savings, credit, or public programs.</w:t>
+      </w:r>
+    </w:p>
+    <w:tbl>
+      <w:tblPr>
+        <w:tblW w:type="dxa" w:w="9360"/>
+        <w:tblBorders>
+          <w:top w:val="single" w:color="auto" w:sz="4"/>
+          <w:left w:val="single" w:color="auto" w:sz="4"/>
+          <w:bottom w:val="single" w:color="auto" w:sz="4"/>
+          <w:right w:val="single" w:color="auto" w:sz="4"/>
+          <w:insideH w:val="single" w:color="auto" w:sz="4"/>
+          <w:insideV w:val="single" w:color="auto" w:sz="4"/>
+        </w:tblBorders>
+      </w:tblPr>
+      <w:tblGrid>
+        <w:gridCol w:w="6360"/>
+        <w:gridCol w:w="3000"/>
+      </w:tblGrid>
+      <w:tr>
+        <w:trPr>
+          <w:tblHeader/>
+        </w:trPr>
+        <w:tc>
+          <w:tcPr>
+            <w:tcW w:type="dxa" w:w="6360"/>
+            <w:tcBorders>
+              <w:top w:val="single" w:color="CCCCCC" w:sz="1"/>
+              <w:left w:val="single" w:color="CCCCCC" w:sz="1"/>
+              <w:bottom w:val="single" w:color="CCCCCC" w:sz="1"/>
+              <w:right w:val="single" w:color="CCCCCC" w:sz="1"/>
+            </w:tcBorders>
+            <w:shd w:fill="009FDA" w:val="clear"/>
+            <w:tcMar>
+              <w:top w:type="dxa" w:w="60"/>
+              <w:left w:type="dxa" w:w="120"/>
+              <w:bottom w:type="dxa" w:w="60"/>
+              <w:right w:type="dxa" w:w="120"/>
+            </w:tcMar>
+          </w:tcPr>
+          <w:p>
+            <w:pPr>
+              <w:jc w:val="left"/>
+            </w:pPr>
+            <w:r>
+              <w:rPr>
+                <w:b/>
+                <w:bCs/>
+                <w:color w:val="FFFFFF"/>
+                <w:sz w:val="18"/>
+                <w:szCs w:val="18"/>
+              </w:rPr>
+              <w:t xml:space="preserve">How households coped with recent shocks (among those reporting a shock)</w:t>
+            </w:r>
+          </w:p>
+        </w:tc>
+        <w:tc>
+          <w:tcPr>
+            <w:tcW w:type="dxa" w:w="3000"/>
+            <w:tcBorders>
+              <w:top w:val="single" w:color="CCCCCC" w:sz="1"/>
+              <w:left w:val="single" w:color="CCCCCC" w:sz="1"/>
+              <w:bottom w:val="single" w:color="CCCCCC" w:sz="1"/>
+              <w:right w:val="single" w:color="CCCCCC" w:sz="1"/>
+            </w:tcBorders>
+            <w:shd w:fill="009FDA" w:val="clear"/>
+            <w:tcMar>
+              <w:top w:type="dxa" w:w="60"/>
+              <w:left w:type="dxa" w:w="120"/>
+              <w:bottom w:type="dxa" w:w="60"/>
+              <w:right w:type="dxa" w:w="120"/>
+            </w:tcMar>
+          </w:tcPr>
+          <w:p>
+            <w:pPr>
+              <w:jc w:val="center"/>
+            </w:pPr>
+            <w:r>
+              <w:rPr>
+                <w:b/>
+                <w:bCs/>
+                <w:color w:val="FFFFFF"/>
+                <w:sz w:val="18"/>
+                <w:szCs w:val="18"/>
+              </w:rPr>
+              <w:t xml:space="preserve">Share</w:t>
+            </w:r>
+          </w:p>
+        </w:tc>
+      </w:tr>
+      <w:tr>
+        <w:tc>
+          <w:tcPr>
+            <w:tcW w:type="dxa" w:w="6360"/>
+            <w:tcBorders>
+              <w:top w:val="single" w:color="CCCCCC" w:sz="1"/>
+              <w:left w:val="single" w:color="CCCCCC" w:sz="1"/>
+              <w:bottom w:val="single" w:color="CCCCCC" w:sz="1"/>
+              <w:right w:val="single" w:color="CCCCCC" w:sz="1"/>
+            </w:tcBorders>
+            <w:shd w:fill="FFFFFF" w:val="clear"/>
+            <w:tcMar>
+              <w:top w:type="dxa" w:w="60"/>
+              <w:left w:type="dxa" w:w="120"/>
+              <w:bottom w:type="dxa" w:w="60"/>
+              <w:right w:type="dxa" w:w="120"/>
+            </w:tcMar>
+          </w:tcPr>
+          <w:p>
+            <w:pPr>
+              <w:jc w:val="left"/>
+            </w:pPr>
+            <w:r>
+              <w:rPr>
+                <w:b w:val="false"/>
+                <w:bCs w:val="false"/>
+                <w:color w:val="000000"/>
+                <w:sz w:val="18"/>
+                <w:szCs w:val="18"/>
+              </w:rPr>
+              <w:t xml:space="preserve">Borrowed from friends or family</w:t>
+            </w:r>
+          </w:p>
+        </w:tc>
+        <w:tc>
+          <w:tcPr>
+            <w:tcW w:type="dxa" w:w="3000"/>
+            <w:tcBorders>
+              <w:top w:val="single" w:color="CCCCCC" w:sz="1"/>
+              <w:left w:val="single" w:color="CCCCCC" w:sz="1"/>
+              <w:bottom w:val="single" w:color="CCCCCC" w:sz="1"/>
+              <w:right w:val="single" w:color="CCCCCC" w:sz="1"/>
+            </w:tcBorders>
+            <w:shd w:fill="FFFFFF" w:val="clear"/>
+            <w:tcMar>
+              <w:top w:type="dxa" w:w="60"/>
+              <w:left w:type="dxa" w:w="120"/>
+              <w:bottom w:type="dxa" w:w="60"/>
+              <w:right w:type="dxa" w:w="120"/>
+            </w:tcMar>
+          </w:tcPr>
+          <w:p>
+            <w:pPr>
+              <w:jc w:val="center"/>
+            </w:pPr>
+            <w:r>
+              <w:rPr>
+                <w:b w:val="false"/>
+                <w:bCs w:val="false"/>
+                <w:color w:val="000000"/>
+                <w:sz w:val="18"/>
+                <w:szCs w:val="18"/>
+              </w:rPr>
+              <w:t xml:space="preserve">24.9%</w:t>
+            </w:r>
+          </w:p>
+        </w:tc>
+      </w:tr>
+      <w:tr>
+        <w:tc>
+          <w:tcPr>
+            <w:tcW w:type="dxa" w:w="6360"/>
+            <w:tcBorders>
+              <w:top w:val="single" w:color="CCCCCC" w:sz="1"/>
+              <w:left w:val="single" w:color="CCCCCC" w:sz="1"/>
+              <w:bottom w:val="single" w:color="CCCCCC" w:sz="1"/>
+              <w:right w:val="single" w:color="CCCCCC" w:sz="1"/>
+            </w:tcBorders>
+            <w:shd w:fill="F2F6F9" w:val="clear"/>
+            <w:tcMar>
+              <w:top w:type="dxa" w:w="60"/>
+              <w:left w:type="dxa" w:w="120"/>
+              <w:bottom w:type="dxa" w:w="60"/>
+              <w:right w:type="dxa" w:w="120"/>
+            </w:tcMar>
+          </w:tcPr>
+          <w:p>
+            <w:pPr>
+              <w:jc w:val="left"/>
+            </w:pPr>
+            <w:r>
+              <w:rPr>
+                <w:b w:val="false"/>
+                <w:bCs w:val="false"/>
+                <w:color w:val="000000"/>
+                <w:sz w:val="18"/>
+                <w:szCs w:val="18"/>
+              </w:rPr>
+              <w:t xml:space="preserve">Received assistance from friends or family</w:t>
+            </w:r>
+          </w:p>
+        </w:tc>
+        <w:tc>
+          <w:tcPr>
+            <w:tcW w:type="dxa" w:w="3000"/>
+            <w:tcBorders>
+              <w:top w:val="single" w:color="CCCCCC" w:sz="1"/>
+              <w:left w:val="single" w:color="CCCCCC" w:sz="1"/>
+              <w:bottom w:val="single" w:color="CCCCCC" w:sz="1"/>
+              <w:right w:val="single" w:color="CCCCCC" w:sz="1"/>
+            </w:tcBorders>
+            <w:shd w:fill="F2F6F9" w:val="clear"/>
+            <w:tcMar>
+              <w:top w:type="dxa" w:w="60"/>
+              <w:left w:type="dxa" w:w="120"/>
+              <w:bottom w:type="dxa" w:w="60"/>
+              <w:right w:type="dxa" w:w="120"/>
+            </w:tcMar>
+          </w:tcPr>
+          <w:p>
+            <w:pPr>
+              <w:jc w:val="center"/>
+            </w:pPr>
+            <w:r>
+              <w:rPr>
+                <w:b w:val="false"/>
+                <w:bCs w:val="false"/>
+                <w:color w:val="000000"/>
+                <w:sz w:val="18"/>
+                <w:szCs w:val="18"/>
+              </w:rPr>
+              <w:t xml:space="preserve">17.9%</w:t>
+            </w:r>
+          </w:p>
+        </w:tc>
+      </w:tr>
+      <w:tr>
+        <w:tc>
+          <w:tcPr>
+            <w:tcW w:type="dxa" w:w="6360"/>
+            <w:tcBorders>
+              <w:top w:val="single" w:color="CCCCCC" w:sz="1"/>
+              <w:left w:val="single" w:color="CCCCCC" w:sz="1"/>
+              <w:bottom w:val="single" w:color="CCCCCC" w:sz="1"/>
+              <w:right w:val="single" w:color="CCCCCC" w:sz="1"/>
+            </w:tcBorders>
+            <w:shd w:fill="FFFFFF" w:val="clear"/>
+            <w:tcMar>
+              <w:top w:type="dxa" w:w="60"/>
+              <w:left w:type="dxa" w:w="120"/>
+              <w:bottom w:type="dxa" w:w="60"/>
+              <w:right w:type="dxa" w:w="120"/>
+            </w:tcMar>
+          </w:tcPr>
+          <w:p>
+            <w:pPr>
+              <w:jc w:val="left"/>
+            </w:pPr>
+            <w:r>
+              <w:rPr>
+                <w:b w:val="false"/>
+                <w:bCs w:val="false"/>
+                <w:color w:val="000000"/>
+                <w:sz w:val="18"/>
+                <w:szCs w:val="18"/>
+              </w:rPr>
+              <w:t xml:space="preserve">Reduced or shifted to cheaper food</w:t>
+            </w:r>
+          </w:p>
+        </w:tc>
+        <w:tc>
+          <w:tcPr>
+            <w:tcW w:type="dxa" w:w="3000"/>
+            <w:tcBorders>
+              <w:top w:val="single" w:color="CCCCCC" w:sz="1"/>
+              <w:left w:val="single" w:color="CCCCCC" w:sz="1"/>
+              <w:bottom w:val="single" w:color="CCCCCC" w:sz="1"/>
+              <w:right w:val="single" w:color="CCCCCC" w:sz="1"/>
+            </w:tcBorders>
+            <w:shd w:fill="FFFFFF" w:val="clear"/>
+            <w:tcMar>
+              <w:top w:type="dxa" w:w="60"/>
+              <w:left w:type="dxa" w:w="120"/>
+              <w:bottom w:type="dxa" w:w="60"/>
+              <w:right w:type="dxa" w:w="120"/>
+            </w:tcMar>
+          </w:tcPr>
+          <w:p>
+            <w:pPr>
+              <w:jc w:val="center"/>
+            </w:pPr>
+            <w:r>
+              <w:rPr>
+                <w:b w:val="false"/>
+                <w:bCs w:val="false"/>
+                <w:color w:val="000000"/>
+                <w:sz w:val="18"/>
+                <w:szCs w:val="18"/>
+              </w:rPr>
+              <w:t xml:space="preserve">10.3%</w:t>
+            </w:r>
+          </w:p>
+        </w:tc>
+      </w:tr>
+      <w:tr>
+        <w:tc>
+          <w:tcPr>
+            <w:tcW w:type="dxa" w:w="6360"/>
+            <w:tcBorders>
+              <w:top w:val="single" w:color="CCCCCC" w:sz="1"/>
+              <w:left w:val="single" w:color="CCCCCC" w:sz="1"/>
+              <w:bottom w:val="single" w:color="CCCCCC" w:sz="1"/>
+              <w:right w:val="single" w:color="CCCCCC" w:sz="1"/>
+            </w:tcBorders>
+            <w:shd w:fill="F2F6F9" w:val="clear"/>
+            <w:tcMar>
+              <w:top w:type="dxa" w:w="60"/>
+              <w:left w:type="dxa" w:w="120"/>
+              <w:bottom w:type="dxa" w:w="60"/>
+              <w:right w:type="dxa" w:w="120"/>
+            </w:tcMar>
+          </w:tcPr>
+          <w:p>
+            <w:pPr>
+              <w:jc w:val="left"/>
+            </w:pPr>
+            <w:r>
+              <w:rPr>
+                <w:b w:val="false"/>
+                <w:bCs w:val="false"/>
+                <w:color w:val="000000"/>
+                <w:sz w:val="18"/>
+                <w:szCs w:val="18"/>
+              </w:rPr>
+              <w:t xml:space="preserve">Took on additional income activities</w:t>
+            </w:r>
+          </w:p>
+        </w:tc>
+        <w:tc>
+          <w:tcPr>
+            <w:tcW w:type="dxa" w:w="3000"/>
+            <w:tcBorders>
+              <w:top w:val="single" w:color="CCCCCC" w:sz="1"/>
+              <w:left w:val="single" w:color="CCCCCC" w:sz="1"/>
+              <w:bottom w:val="single" w:color="CCCCCC" w:sz="1"/>
+              <w:right w:val="single" w:color="CCCCCC" w:sz="1"/>
+            </w:tcBorders>
+            <w:shd w:fill="F2F6F9" w:val="clear"/>
+            <w:tcMar>
+              <w:top w:type="dxa" w:w="60"/>
+              <w:left w:type="dxa" w:w="120"/>
+              <w:bottom w:type="dxa" w:w="60"/>
+              <w:right w:type="dxa" w:w="120"/>
+            </w:tcMar>
+          </w:tcPr>
+          <w:p>
+            <w:pPr>
+              <w:jc w:val="center"/>
+            </w:pPr>
+            <w:r>
+              <w:rPr>
+                <w:b w:val="false"/>
+                <w:bCs w:val="false"/>
+                <w:color w:val="000000"/>
+                <w:sz w:val="18"/>
+                <w:szCs w:val="18"/>
+              </w:rPr>
+              <w:t xml:space="preserve">9.1%</w:t>
+            </w:r>
+          </w:p>
+        </w:tc>
+      </w:tr>
+      <w:tr>
+        <w:tc>
+          <w:tcPr>
+            <w:tcW w:type="dxa" w:w="6360"/>
+            <w:tcBorders>
+              <w:top w:val="single" w:color="CCCCCC" w:sz="1"/>
+              <w:left w:val="single" w:color="CCCCCC" w:sz="1"/>
+              <w:bottom w:val="single" w:color="CCCCCC" w:sz="1"/>
+              <w:right w:val="single" w:color="CCCCCC" w:sz="1"/>
+            </w:tcBorders>
+            <w:shd w:fill="FFFFFF" w:val="clear"/>
+            <w:tcMar>
+              <w:top w:type="dxa" w:w="60"/>
+              <w:left w:type="dxa" w:w="120"/>
+              <w:bottom w:type="dxa" w:w="60"/>
+              <w:right w:type="dxa" w:w="120"/>
+            </w:tcMar>
+          </w:tcPr>
+          <w:p>
+            <w:pPr>
+              <w:jc w:val="left"/>
+            </w:pPr>
+            <w:r>
+              <w:rPr>
+                <w:b w:val="false"/>
+                <w:bCs w:val="false"/>
+                <w:color w:val="000000"/>
+                <w:sz w:val="18"/>
+                <w:szCs w:val="18"/>
+              </w:rPr>
+              <w:t xml:space="preserve">Relied on savings</w:t>
+            </w:r>
+          </w:p>
+        </w:tc>
+        <w:tc>
+          <w:tcPr>
+            <w:tcW w:type="dxa" w:w="3000"/>
+            <w:tcBorders>
+              <w:top w:val="single" w:color="CCCCCC" w:sz="1"/>
+              <w:left w:val="single" w:color="CCCCCC" w:sz="1"/>
+              <w:bottom w:val="single" w:color="CCCCCC" w:sz="1"/>
+              <w:right w:val="single" w:color="CCCCCC" w:sz="1"/>
+            </w:tcBorders>
+            <w:shd w:fill="FFFFFF" w:val="clear"/>
+            <w:tcMar>
+              <w:top w:type="dxa" w:w="60"/>
+              <w:left w:type="dxa" w:w="120"/>
+              <w:bottom w:type="dxa" w:w="60"/>
+              <w:right w:type="dxa" w:w="120"/>
+            </w:tcMar>
+          </w:tcPr>
+          <w:p>
+            <w:pPr>
+              <w:jc w:val="center"/>
+            </w:pPr>
+            <w:r>
+              <w:rPr>
+                <w:b w:val="false"/>
+                <w:bCs w:val="false"/>
+                <w:color w:val="000000"/>
+                <w:sz w:val="18"/>
+                <w:szCs w:val="18"/>
+              </w:rPr>
+              <w:t xml:space="preserve">7.4%</w:t>
+            </w:r>
+          </w:p>
+        </w:tc>
+      </w:tr>
+      <w:tr>
+        <w:tc>
+          <w:tcPr>
+            <w:tcW w:type="dxa" w:w="6360"/>
+            <w:tcBorders>
+              <w:top w:val="single" w:color="CCCCCC" w:sz="1"/>
+              <w:left w:val="single" w:color="CCCCCC" w:sz="1"/>
+              <w:bottom w:val="single" w:color="CCCCCC" w:sz="1"/>
+              <w:right w:val="single" w:color="CCCCCC" w:sz="1"/>
+            </w:tcBorders>
+            <w:shd w:fill="F2F6F9" w:val="clear"/>
+            <w:tcMar>
+              <w:top w:type="dxa" w:w="60"/>
+              <w:left w:type="dxa" w:w="120"/>
+              <w:bottom w:type="dxa" w:w="60"/>
+              <w:right w:type="dxa" w:w="120"/>
+            </w:tcMar>
+          </w:tcPr>
+          <w:p>
+            <w:pPr>
+              <w:jc w:val="left"/>
+            </w:pPr>
+            <w:r>
+              <w:rPr>
+                <w:b w:val="false"/>
+                <w:bCs w:val="false"/>
+                <w:color w:val="000000"/>
+                <w:sz w:val="18"/>
+                <w:szCs w:val="18"/>
+              </w:rPr>
+              <w:t xml:space="preserve">Received assistance from government</w:t>
+            </w:r>
+          </w:p>
+        </w:tc>
+        <w:tc>
+          <w:tcPr>
+            <w:tcW w:type="dxa" w:w="3000"/>
+            <w:tcBorders>
+              <w:top w:val="single" w:color="CCCCCC" w:sz="1"/>
+              <w:left w:val="single" w:color="CCCCCC" w:sz="1"/>
+              <w:bottom w:val="single" w:color="CCCCCC" w:sz="1"/>
+              <w:right w:val="single" w:color="CCCCCC" w:sz="1"/>
+            </w:tcBorders>
+            <w:shd w:fill="F2F6F9" w:val="clear"/>
+            <w:tcMar>
+              <w:top w:type="dxa" w:w="60"/>
+              <w:left w:type="dxa" w:w="120"/>
+              <w:bottom w:type="dxa" w:w="60"/>
+              <w:right w:type="dxa" w:w="120"/>
+            </w:tcMar>
+          </w:tcPr>
+          <w:p>
+            <w:pPr>
+              <w:jc w:val="center"/>
+            </w:pPr>
+            <w:r>
+              <w:rPr>
+                <w:b w:val="false"/>
+                <w:bCs w:val="false"/>
+                <w:color w:val="000000"/>
+                <w:sz w:val="18"/>
+                <w:szCs w:val="18"/>
+              </w:rPr>
+              <w:t xml:space="preserve">7.2%</w:t>
+            </w:r>
+          </w:p>
+        </w:tc>
+      </w:tr>
+      <w:tr>
+        <w:tc>
+          <w:tcPr>
+            <w:tcW w:type="dxa" w:w="6360"/>
+            <w:tcBorders>
+              <w:top w:val="single" w:color="CCCCCC" w:sz="1"/>
+              <w:left w:val="single" w:color="CCCCCC" w:sz="1"/>
+              <w:bottom w:val="single" w:color="CCCCCC" w:sz="1"/>
+              <w:right w:val="single" w:color="CCCCCC" w:sz="1"/>
+            </w:tcBorders>
+            <w:shd w:fill="FFFFFF" w:val="clear"/>
+            <w:tcMar>
+              <w:top w:type="dxa" w:w="60"/>
+              <w:left w:type="dxa" w:w="120"/>
+              <w:bottom w:type="dxa" w:w="60"/>
+              <w:right w:type="dxa" w:w="120"/>
+            </w:tcMar>
+          </w:tcPr>
+          <w:p>
+            <w:pPr>
+              <w:jc w:val="left"/>
+            </w:pPr>
+            <w:r>
+              <w:rPr>
+                <w:b w:val="false"/>
+                <w:bCs w:val="false"/>
+                <w:color w:val="000000"/>
+                <w:sz w:val="18"/>
+                <w:szCs w:val="18"/>
+              </w:rPr>
+              <w:t xml:space="preserve">Increased hours of work</w:t>
+            </w:r>
+          </w:p>
+        </w:tc>
+        <w:tc>
+          <w:tcPr>
+            <w:tcW w:type="dxa" w:w="3000"/>
+            <w:tcBorders>
+              <w:top w:val="single" w:color="CCCCCC" w:sz="1"/>
+              <w:left w:val="single" w:color="CCCCCC" w:sz="1"/>
+              <w:bottom w:val="single" w:color="CCCCCC" w:sz="1"/>
+              <w:right w:val="single" w:color="CCCCCC" w:sz="1"/>
+            </w:tcBorders>
+            <w:shd w:fill="FFFFFF" w:val="clear"/>
+            <w:tcMar>
+              <w:top w:type="dxa" w:w="60"/>
+              <w:left w:type="dxa" w:w="120"/>
+              <w:bottom w:type="dxa" w:w="60"/>
+              <w:right w:type="dxa" w:w="120"/>
+            </w:tcMar>
+          </w:tcPr>
+          <w:p>
+            <w:pPr>
+              <w:jc w:val="center"/>
+            </w:pPr>
+            <w:r>
+              <w:rPr>
+                <w:b w:val="false"/>
+                <w:bCs w:val="false"/>
+                <w:color w:val="000000"/>
+                <w:sz w:val="18"/>
+                <w:szCs w:val="18"/>
+              </w:rPr>
+              <w:t xml:space="preserve">5.6%</w:t>
+            </w:r>
+          </w:p>
+        </w:tc>
+      </w:tr>
+      <w:tr>
+        <w:tc>
+          <w:tcPr>
+            <w:tcW w:type="dxa" w:w="6360"/>
+            <w:tcBorders>
+              <w:top w:val="single" w:color="CCCCCC" w:sz="1"/>
+              <w:left w:val="single" w:color="CCCCCC" w:sz="1"/>
+              <w:bottom w:val="single" w:color="CCCCCC" w:sz="1"/>
+              <w:right w:val="single" w:color="CCCCCC" w:sz="1"/>
+            </w:tcBorders>
+            <w:shd w:fill="F2F6F9" w:val="clear"/>
+            <w:tcMar>
+              <w:top w:type="dxa" w:w="60"/>
+              <w:left w:type="dxa" w:w="120"/>
+              <w:bottom w:type="dxa" w:w="60"/>
+              <w:right w:type="dxa" w:w="120"/>
+            </w:tcMar>
+          </w:tcPr>
+          <w:p>
+            <w:pPr>
+              <w:jc w:val="left"/>
+            </w:pPr>
+            <w:r>
+              <w:rPr>
+                <w:b w:val="false"/>
+                <w:bCs w:val="false"/>
+                <w:color w:val="000000"/>
+                <w:sz w:val="18"/>
+                <w:szCs w:val="18"/>
+              </w:rPr>
+              <w:t xml:space="preserve">Took a loan from a financial institution</w:t>
+            </w:r>
+          </w:p>
+        </w:tc>
+        <w:tc>
+          <w:tcPr>
+            <w:tcW w:type="dxa" w:w="3000"/>
+            <w:tcBorders>
+              <w:top w:val="single" w:color="CCCCCC" w:sz="1"/>
+              <w:left w:val="single" w:color="CCCCCC" w:sz="1"/>
+              <w:bottom w:val="single" w:color="CCCCCC" w:sz="1"/>
+              <w:right w:val="single" w:color="CCCCCC" w:sz="1"/>
+            </w:tcBorders>
+            <w:shd w:fill="F2F6F9" w:val="clear"/>
+            <w:tcMar>
+              <w:top w:type="dxa" w:w="60"/>
+              <w:left w:type="dxa" w:w="120"/>
+              <w:bottom w:type="dxa" w:w="60"/>
+              <w:right w:type="dxa" w:w="120"/>
+            </w:tcMar>
+          </w:tcPr>
+          <w:p>
+            <w:pPr>
+              <w:jc w:val="center"/>
+            </w:pPr>
+            <w:r>
+              <w:rPr>
+                <w:b w:val="false"/>
+                <w:bCs w:val="false"/>
+                <w:color w:val="000000"/>
+                <w:sz w:val="18"/>
+                <w:szCs w:val="18"/>
+              </w:rPr>
+              <w:t xml:space="preserve">2.5%</w:t>
+            </w:r>
+          </w:p>
+        </w:tc>
+      </w:tr>
+    </w:tbl>
+    <w:p>
+      <w:pPr>
+        <w:pStyle w:val="Heading2"/>
+      </w:pPr>
+      <w:r>
+        <w:t xml:space="preserve">Confidence in the public response is limited</w:t>
+      </w:r>
+    </w:p>
+    <w:p>
+      <w:pPr>
+        <w:spacing w:after="120"/>
+      </w:pPr>
+      <w:r>
+        <w:rPr>
+          <w:sz w:val="20"/>
+          <w:szCs w:val="20"/>
+        </w:rPr>
+        <w:t xml:space="preserve">Households are skeptical that the government is doing enough: about half disagree (49.3 percent in Round 6, 45.7 percent in Round 7) and only around a quarter agree (24.6 and 25.5 percent), with the rest neutral. Because the crisis registers mainly through prices, its household-welfare consequences will track domestic fuel and food prices rather than labor-market or remittance disruptions. The low share that sees the response as adequate, combined with thin use of formal support, points to room for clearer public communication on price and energy measures and for strengthening the formal safety net that few households currently draw on.</w:t>
       </w:r>
     </w:p>
     <w:p>
@@ -1616,7 +2585,7 @@
           <w:sz w:val="16"/>
           <w:szCs w:val="16"/>
         </w:rPr>
-        <w:t xml:space="preserve">Listening to the Philippines (L2PHL / Project TIPON) CATI panel, Rounds 6 (n = 1,167) and 7 (n = 993), fielded April–May 2026; questions V13–V18 (Views module). Figures are shares of responding households. Survey-weighted estimates and breakdowns by region and income quintile are pending a household crosswalk and will follow in a revised version.</w:t>
+        <w:t xml:space="preserve">Listening to the Philippines (L2PHL / Project TIPON) CATI panel, Rounds 6 (n = 1,167) and 7 (n = 993), fielded April–May 2026; crisis-perception questions V13–V18 (Views module). Coping mechanisms are from the shocks module, among households reporting a recent shock (486 responses across the two rounds). Figures are shares of responding households and are unweighted. Survey-weighted estimates and breakdowns by region and income quintile are pending a household crosswalk and will follow in a revised version (v2).</w:t>
       </w:r>
     </w:p>
     <w:sectPr>
@@ -1820,18 +2789,6 @@
       <w:lvlJc w:val="left"/>
       <w:pPr>
         <w:ind w:left="6480" w:hanging="360"/>
-      </w:pPr>
-    </w:lvl>
-  </w:abstractNum>
-  <w:abstractNum w:abstractNumId="2" w15:restartNumberingAfterBreak="0">
-    <w:multiLevelType w:val="hybridMultilevel"/>
-    <w:lvl w:ilvl="0" w15:tentative="1">
-      <w:start w:val="1"/>
-      <w:numFmt w:val="bullet"/>
-      <w:lvlText w:val="•"/>
-      <w:lvlJc w:val="left"/>
-      <w:pPr>
-        <w:ind w:left="480" w:hanging="240"/>
       </w:pPr>
     </w:lvl>
   </w:abstractNum>

</xml_diff>

<commit_message>
crisis note: set Garamond font, World Bank navy/blue palette
</commit_message>
<xml_diff>
--- a/CATI/Analysis/SL/L2PHL_CATI_MiddleEast_Crisis_Note_Jun2026.docx
+++ b/CATI/Analysis/SL/L2PHL_CATI_MiddleEast_Crisis_Note_Jun2026.docx
@@ -2806,7 +2806,7 @@
   <w:docDefaults>
     <w:rPrDefault>
       <w:rPr>
-        <w:rFonts w:ascii="Arial" w:cs="Arial" w:eastAsia="Arial" w:hAnsi="Arial"/>
+        <w:rFonts w:ascii="Garamond" w:cs="Garamond" w:eastAsia="Garamond" w:hAnsi="Garamond"/>
         <w:sz w:val="20"/>
         <w:szCs w:val="20"/>
       </w:rPr>
@@ -2994,7 +2994,7 @@
       <w:outlineLvl w:val="1"/>
     </w:pPr>
     <w:rPr>
-      <w:rFonts w:ascii="Arial" w:cs="Arial" w:eastAsia="Arial" w:hAnsi="Arial"/>
+      <w:rFonts w:ascii="Garamond" w:cs="Garamond" w:eastAsia="Garamond" w:hAnsi="Garamond"/>
       <w:b/>
       <w:bCs/>
       <w:color w:val="002244"/>

</xml_diff>

<commit_message>
crisis note: add income-quintile + region breakdowns (S2S imputed income linked via PSGC, 99.3% match)
</commit_message>
<xml_diff>
--- a/CATI/Analysis/SL/L2PHL_CATI_MiddleEast_Crisis_Note_Jun2026.docx
+++ b/CATI/Analysis/SL/L2PHL_CATI_MiddleEast_Crisis_Note_Jun2026.docx
@@ -27,7 +27,7 @@
           <w:sz w:val="16"/>
           <w:szCs w:val="16"/>
         </w:rPr>
-        <w:t xml:space="preserve">Crisis note · Preliminary (v1) · June 2026</w:t>
+        <w:t xml:space="preserve">Crisis note · June 2026</w:t>
       </w:r>
     </w:p>
     <w:p>
@@ -1414,6 +1414,1773 @@
         <w:pStyle w:val="Heading2"/>
       </w:pPr>
       <w:r>
+        <w:t xml:space="preserve">Concern is broad-based — across incomes and regions</w:t>
+      </w:r>
+    </w:p>
+    <w:p>
+      <w:pPr>
+        <w:spacing w:after="120"/>
+      </w:pPr>
+      <w:r>
+        <w:rPr>
+          <w:b/>
+          <w:bCs/>
+          <w:sz w:val="20"/>
+          <w:szCs w:val="20"/>
+        </w:rPr>
+        <w:t xml:space="preserve">The anxiety cuts across the income distribution. </w:t>
+      </w:r>
+      <w:r>
+        <w:rPr>
+          <w:sz w:val="20"/>
+          <w:szCs w:val="20"/>
+        </w:rPr>
+        <w:t xml:space="preserve">Concern barely varies from the poorest to the richest fifth of households (94.0 percent in the bottom income quintile, 91.2 percent in the top), and the same flatness holds for perceived impact and expected inflation. A Middle East price shock is read as a near-universal cost-of-living concern rather than a problem confined to poorer households, and confidence in the government response is uniformly low across quintiles, between about 21 and 31 percent.</w:t>
+      </w:r>
+    </w:p>
+    <w:tbl>
+      <w:tblPr>
+        <w:tblW w:type="dxa" w:w="9360"/>
+        <w:tblBorders>
+          <w:top w:val="single" w:color="auto" w:sz="4"/>
+          <w:left w:val="single" w:color="auto" w:sz="4"/>
+          <w:bottom w:val="single" w:color="auto" w:sz="4"/>
+          <w:right w:val="single" w:color="auto" w:sz="4"/>
+          <w:insideH w:val="single" w:color="auto" w:sz="4"/>
+          <w:insideV w:val="single" w:color="auto" w:sz="4"/>
+        </w:tblBorders>
+      </w:tblPr>
+      <w:tblGrid>
+        <w:gridCol w:w="2640"/>
+        <w:gridCol w:w="1680"/>
+        <w:gridCol w:w="1680"/>
+        <w:gridCol w:w="1680"/>
+        <w:gridCol w:w="1680"/>
+      </w:tblGrid>
+      <w:tr>
+        <w:trPr>
+          <w:tblHeader/>
+        </w:trPr>
+        <w:tc>
+          <w:tcPr>
+            <w:tcW w:type="dxa" w:w="2640"/>
+            <w:tcBorders>
+              <w:top w:val="single" w:color="CCCCCC" w:sz="1"/>
+              <w:left w:val="single" w:color="CCCCCC" w:sz="1"/>
+              <w:bottom w:val="single" w:color="CCCCCC" w:sz="1"/>
+              <w:right w:val="single" w:color="CCCCCC" w:sz="1"/>
+            </w:tcBorders>
+            <w:shd w:fill="002244" w:val="clear"/>
+            <w:tcMar>
+              <w:top w:type="dxa" w:w="60"/>
+              <w:left w:type="dxa" w:w="120"/>
+              <w:bottom w:type="dxa" w:w="60"/>
+              <w:right w:type="dxa" w:w="120"/>
+            </w:tcMar>
+          </w:tcPr>
+          <w:p>
+            <w:pPr>
+              <w:jc w:val="left"/>
+            </w:pPr>
+            <w:r>
+              <w:rPr>
+                <w:b/>
+                <w:bCs/>
+                <w:color w:val="FFFFFF"/>
+                <w:sz w:val="18"/>
+                <w:szCs w:val="18"/>
+              </w:rPr>
+              <w:t xml:space="preserve">Income quintile</w:t>
+            </w:r>
+          </w:p>
+        </w:tc>
+        <w:tc>
+          <w:tcPr>
+            <w:tcW w:type="dxa" w:w="1680"/>
+            <w:tcBorders>
+              <w:top w:val="single" w:color="CCCCCC" w:sz="1"/>
+              <w:left w:val="single" w:color="CCCCCC" w:sz="1"/>
+              <w:bottom w:val="single" w:color="CCCCCC" w:sz="1"/>
+              <w:right w:val="single" w:color="CCCCCC" w:sz="1"/>
+            </w:tcBorders>
+            <w:shd w:fill="002244" w:val="clear"/>
+            <w:tcMar>
+              <w:top w:type="dxa" w:w="60"/>
+              <w:left w:type="dxa" w:w="120"/>
+              <w:bottom w:type="dxa" w:w="60"/>
+              <w:right w:type="dxa" w:w="120"/>
+            </w:tcMar>
+          </w:tcPr>
+          <w:p>
+            <w:pPr>
+              <w:jc w:val="center"/>
+            </w:pPr>
+            <w:r>
+              <w:rPr>
+                <w:b/>
+                <w:bCs/>
+                <w:color w:val="FFFFFF"/>
+                <w:sz w:val="18"/>
+                <w:szCs w:val="18"/>
+              </w:rPr>
+              <w:t xml:space="preserve">Concerned</w:t>
+            </w:r>
+          </w:p>
+        </w:tc>
+        <w:tc>
+          <w:tcPr>
+            <w:tcW w:type="dxa" w:w="1680"/>
+            <w:tcBorders>
+              <w:top w:val="single" w:color="CCCCCC" w:sz="1"/>
+              <w:left w:val="single" w:color="CCCCCC" w:sz="1"/>
+              <w:bottom w:val="single" w:color="CCCCCC" w:sz="1"/>
+              <w:right w:val="single" w:color="CCCCCC" w:sz="1"/>
+            </w:tcBorders>
+            <w:shd w:fill="002244" w:val="clear"/>
+            <w:tcMar>
+              <w:top w:type="dxa" w:w="60"/>
+              <w:left w:type="dxa" w:w="120"/>
+              <w:bottom w:type="dxa" w:w="60"/>
+              <w:right w:type="dxa" w:w="120"/>
+            </w:tcMar>
+          </w:tcPr>
+          <w:p>
+            <w:pPr>
+              <w:jc w:val="center"/>
+            </w:pPr>
+            <w:r>
+              <w:rPr>
+                <w:b/>
+                <w:bCs/>
+                <w:color w:val="FFFFFF"/>
+                <w:sz w:val="18"/>
+                <w:szCs w:val="18"/>
+              </w:rPr>
+              <w:t xml:space="preserve">Severe/mod. impact</w:t>
+            </w:r>
+          </w:p>
+        </w:tc>
+        <w:tc>
+          <w:tcPr>
+            <w:tcW w:type="dxa" w:w="1680"/>
+            <w:tcBorders>
+              <w:top w:val="single" w:color="CCCCCC" w:sz="1"/>
+              <w:left w:val="single" w:color="CCCCCC" w:sz="1"/>
+              <w:bottom w:val="single" w:color="CCCCCC" w:sz="1"/>
+              <w:right w:val="single" w:color="CCCCCC" w:sz="1"/>
+            </w:tcBorders>
+            <w:shd w:fill="002244" w:val="clear"/>
+            <w:tcMar>
+              <w:top w:type="dxa" w:w="60"/>
+              <w:left w:type="dxa" w:w="120"/>
+              <w:bottom w:type="dxa" w:w="60"/>
+              <w:right w:type="dxa" w:w="120"/>
+            </w:tcMar>
+          </w:tcPr>
+          <w:p>
+            <w:pPr>
+              <w:jc w:val="center"/>
+            </w:pPr>
+            <w:r>
+              <w:rPr>
+                <w:b/>
+                <w:bCs/>
+                <w:color w:val="FFFFFF"/>
+                <w:sz w:val="18"/>
+                <w:szCs w:val="18"/>
+              </w:rPr>
+              <w:t xml:space="preserve">Expect faster prices</w:t>
+            </w:r>
+          </w:p>
+        </w:tc>
+        <w:tc>
+          <w:tcPr>
+            <w:tcW w:type="dxa" w:w="1680"/>
+            <w:tcBorders>
+              <w:top w:val="single" w:color="CCCCCC" w:sz="1"/>
+              <w:left w:val="single" w:color="CCCCCC" w:sz="1"/>
+              <w:bottom w:val="single" w:color="CCCCCC" w:sz="1"/>
+              <w:right w:val="single" w:color="CCCCCC" w:sz="1"/>
+            </w:tcBorders>
+            <w:shd w:fill="002244" w:val="clear"/>
+            <w:tcMar>
+              <w:top w:type="dxa" w:w="60"/>
+              <w:left w:type="dxa" w:w="120"/>
+              <w:bottom w:type="dxa" w:w="60"/>
+              <w:right w:type="dxa" w:w="120"/>
+            </w:tcMar>
+          </w:tcPr>
+          <w:p>
+            <w:pPr>
+              <w:jc w:val="center"/>
+            </w:pPr>
+            <w:r>
+              <w:rPr>
+                <w:b/>
+                <w:bCs/>
+                <w:color w:val="FFFFFF"/>
+                <w:sz w:val="18"/>
+                <w:szCs w:val="18"/>
+              </w:rPr>
+              <w:t xml:space="preserve">Govt doing enough</w:t>
+            </w:r>
+          </w:p>
+        </w:tc>
+      </w:tr>
+      <w:tr>
+        <w:tc>
+          <w:tcPr>
+            <w:tcW w:type="dxa" w:w="2640"/>
+            <w:tcBorders>
+              <w:top w:val="single" w:color="CCCCCC" w:sz="1"/>
+              <w:left w:val="single" w:color="CCCCCC" w:sz="1"/>
+              <w:bottom w:val="single" w:color="CCCCCC" w:sz="1"/>
+              <w:right w:val="single" w:color="CCCCCC" w:sz="1"/>
+            </w:tcBorders>
+            <w:shd w:fill="FFFFFF" w:val="clear"/>
+            <w:tcMar>
+              <w:top w:type="dxa" w:w="60"/>
+              <w:left w:type="dxa" w:w="120"/>
+              <w:bottom w:type="dxa" w:w="60"/>
+              <w:right w:type="dxa" w:w="120"/>
+            </w:tcMar>
+          </w:tcPr>
+          <w:p>
+            <w:pPr>
+              <w:jc w:val="left"/>
+            </w:pPr>
+            <w:r>
+              <w:rPr>
+                <w:b w:val="false"/>
+                <w:bCs w:val="false"/>
+                <w:color w:val="000000"/>
+                <w:sz w:val="18"/>
+                <w:szCs w:val="18"/>
+              </w:rPr>
+              <w:t xml:space="preserve">Q1 (poorest)</w:t>
+            </w:r>
+          </w:p>
+        </w:tc>
+        <w:tc>
+          <w:tcPr>
+            <w:tcW w:type="dxa" w:w="1680"/>
+            <w:tcBorders>
+              <w:top w:val="single" w:color="CCCCCC" w:sz="1"/>
+              <w:left w:val="single" w:color="CCCCCC" w:sz="1"/>
+              <w:bottom w:val="single" w:color="CCCCCC" w:sz="1"/>
+              <w:right w:val="single" w:color="CCCCCC" w:sz="1"/>
+            </w:tcBorders>
+            <w:shd w:fill="FFFFFF" w:val="clear"/>
+            <w:tcMar>
+              <w:top w:type="dxa" w:w="60"/>
+              <w:left w:type="dxa" w:w="120"/>
+              <w:bottom w:type="dxa" w:w="60"/>
+              <w:right w:type="dxa" w:w="120"/>
+            </w:tcMar>
+          </w:tcPr>
+          <w:p>
+            <w:pPr>
+              <w:jc w:val="center"/>
+            </w:pPr>
+            <w:r>
+              <w:rPr>
+                <w:b w:val="false"/>
+                <w:bCs w:val="false"/>
+                <w:color w:val="000000"/>
+                <w:sz w:val="18"/>
+                <w:szCs w:val="18"/>
+              </w:rPr>
+              <w:t xml:space="preserve">94.0%</w:t>
+            </w:r>
+          </w:p>
+        </w:tc>
+        <w:tc>
+          <w:tcPr>
+            <w:tcW w:type="dxa" w:w="1680"/>
+            <w:tcBorders>
+              <w:top w:val="single" w:color="CCCCCC" w:sz="1"/>
+              <w:left w:val="single" w:color="CCCCCC" w:sz="1"/>
+              <w:bottom w:val="single" w:color="CCCCCC" w:sz="1"/>
+              <w:right w:val="single" w:color="CCCCCC" w:sz="1"/>
+            </w:tcBorders>
+            <w:shd w:fill="FFFFFF" w:val="clear"/>
+            <w:tcMar>
+              <w:top w:type="dxa" w:w="60"/>
+              <w:left w:type="dxa" w:w="120"/>
+              <w:bottom w:type="dxa" w:w="60"/>
+              <w:right w:type="dxa" w:w="120"/>
+            </w:tcMar>
+          </w:tcPr>
+          <w:p>
+            <w:pPr>
+              <w:jc w:val="center"/>
+            </w:pPr>
+            <w:r>
+              <w:rPr>
+                <w:b w:val="false"/>
+                <w:bCs w:val="false"/>
+                <w:color w:val="000000"/>
+                <w:sz w:val="18"/>
+                <w:szCs w:val="18"/>
+              </w:rPr>
+              <w:t xml:space="preserve">91.8%</w:t>
+            </w:r>
+          </w:p>
+        </w:tc>
+        <w:tc>
+          <w:tcPr>
+            <w:tcW w:type="dxa" w:w="1680"/>
+            <w:tcBorders>
+              <w:top w:val="single" w:color="CCCCCC" w:sz="1"/>
+              <w:left w:val="single" w:color="CCCCCC" w:sz="1"/>
+              <w:bottom w:val="single" w:color="CCCCCC" w:sz="1"/>
+              <w:right w:val="single" w:color="CCCCCC" w:sz="1"/>
+            </w:tcBorders>
+            <w:shd w:fill="FFFFFF" w:val="clear"/>
+            <w:tcMar>
+              <w:top w:type="dxa" w:w="60"/>
+              <w:left w:type="dxa" w:w="120"/>
+              <w:bottom w:type="dxa" w:w="60"/>
+              <w:right w:type="dxa" w:w="120"/>
+            </w:tcMar>
+          </w:tcPr>
+          <w:p>
+            <w:pPr>
+              <w:jc w:val="center"/>
+            </w:pPr>
+            <w:r>
+              <w:rPr>
+                <w:b w:val="false"/>
+                <w:bCs w:val="false"/>
+                <w:color w:val="000000"/>
+                <w:sz w:val="18"/>
+                <w:szCs w:val="18"/>
+              </w:rPr>
+              <w:t xml:space="preserve">71.1%</w:t>
+            </w:r>
+          </w:p>
+        </w:tc>
+        <w:tc>
+          <w:tcPr>
+            <w:tcW w:type="dxa" w:w="1680"/>
+            <w:tcBorders>
+              <w:top w:val="single" w:color="CCCCCC" w:sz="1"/>
+              <w:left w:val="single" w:color="CCCCCC" w:sz="1"/>
+              <w:bottom w:val="single" w:color="CCCCCC" w:sz="1"/>
+              <w:right w:val="single" w:color="CCCCCC" w:sz="1"/>
+            </w:tcBorders>
+            <w:shd w:fill="FFFFFF" w:val="clear"/>
+            <w:tcMar>
+              <w:top w:type="dxa" w:w="60"/>
+              <w:left w:type="dxa" w:w="120"/>
+              <w:bottom w:type="dxa" w:w="60"/>
+              <w:right w:type="dxa" w:w="120"/>
+            </w:tcMar>
+          </w:tcPr>
+          <w:p>
+            <w:pPr>
+              <w:jc w:val="center"/>
+            </w:pPr>
+            <w:r>
+              <w:rPr>
+                <w:b w:val="false"/>
+                <w:bCs w:val="false"/>
+                <w:color w:val="000000"/>
+                <w:sz w:val="18"/>
+                <w:szCs w:val="18"/>
+              </w:rPr>
+              <w:t xml:space="preserve">23.6%</w:t>
+            </w:r>
+          </w:p>
+        </w:tc>
+      </w:tr>
+      <w:tr>
+        <w:tc>
+          <w:tcPr>
+            <w:tcW w:type="dxa" w:w="2640"/>
+            <w:tcBorders>
+              <w:top w:val="single" w:color="CCCCCC" w:sz="1"/>
+              <w:left w:val="single" w:color="CCCCCC" w:sz="1"/>
+              <w:bottom w:val="single" w:color="CCCCCC" w:sz="1"/>
+              <w:right w:val="single" w:color="CCCCCC" w:sz="1"/>
+            </w:tcBorders>
+            <w:shd w:fill="F2F6F9" w:val="clear"/>
+            <w:tcMar>
+              <w:top w:type="dxa" w:w="60"/>
+              <w:left w:type="dxa" w:w="120"/>
+              <w:bottom w:type="dxa" w:w="60"/>
+              <w:right w:type="dxa" w:w="120"/>
+            </w:tcMar>
+          </w:tcPr>
+          <w:p>
+            <w:pPr>
+              <w:jc w:val="left"/>
+            </w:pPr>
+            <w:r>
+              <w:rPr>
+                <w:b w:val="false"/>
+                <w:bCs w:val="false"/>
+                <w:color w:val="000000"/>
+                <w:sz w:val="18"/>
+                <w:szCs w:val="18"/>
+              </w:rPr>
+              <w:t xml:space="preserve">Q2</w:t>
+            </w:r>
+          </w:p>
+        </w:tc>
+        <w:tc>
+          <w:tcPr>
+            <w:tcW w:type="dxa" w:w="1680"/>
+            <w:tcBorders>
+              <w:top w:val="single" w:color="CCCCCC" w:sz="1"/>
+              <w:left w:val="single" w:color="CCCCCC" w:sz="1"/>
+              <w:bottom w:val="single" w:color="CCCCCC" w:sz="1"/>
+              <w:right w:val="single" w:color="CCCCCC" w:sz="1"/>
+            </w:tcBorders>
+            <w:shd w:fill="F2F6F9" w:val="clear"/>
+            <w:tcMar>
+              <w:top w:type="dxa" w:w="60"/>
+              <w:left w:type="dxa" w:w="120"/>
+              <w:bottom w:type="dxa" w:w="60"/>
+              <w:right w:type="dxa" w:w="120"/>
+            </w:tcMar>
+          </w:tcPr>
+          <w:p>
+            <w:pPr>
+              <w:jc w:val="center"/>
+            </w:pPr>
+            <w:r>
+              <w:rPr>
+                <w:b w:val="false"/>
+                <w:bCs w:val="false"/>
+                <w:color w:val="000000"/>
+                <w:sz w:val="18"/>
+                <w:szCs w:val="18"/>
+              </w:rPr>
+              <w:t xml:space="preserve">93.2%</w:t>
+            </w:r>
+          </w:p>
+        </w:tc>
+        <w:tc>
+          <w:tcPr>
+            <w:tcW w:type="dxa" w:w="1680"/>
+            <w:tcBorders>
+              <w:top w:val="single" w:color="CCCCCC" w:sz="1"/>
+              <w:left w:val="single" w:color="CCCCCC" w:sz="1"/>
+              <w:bottom w:val="single" w:color="CCCCCC" w:sz="1"/>
+              <w:right w:val="single" w:color="CCCCCC" w:sz="1"/>
+            </w:tcBorders>
+            <w:shd w:fill="F2F6F9" w:val="clear"/>
+            <w:tcMar>
+              <w:top w:type="dxa" w:w="60"/>
+              <w:left w:type="dxa" w:w="120"/>
+              <w:bottom w:type="dxa" w:w="60"/>
+              <w:right w:type="dxa" w:w="120"/>
+            </w:tcMar>
+          </w:tcPr>
+          <w:p>
+            <w:pPr>
+              <w:jc w:val="center"/>
+            </w:pPr>
+            <w:r>
+              <w:rPr>
+                <w:b w:val="false"/>
+                <w:bCs w:val="false"/>
+                <w:color w:val="000000"/>
+                <w:sz w:val="18"/>
+                <w:szCs w:val="18"/>
+              </w:rPr>
+              <w:t xml:space="preserve">92.1%</w:t>
+            </w:r>
+          </w:p>
+        </w:tc>
+        <w:tc>
+          <w:tcPr>
+            <w:tcW w:type="dxa" w:w="1680"/>
+            <w:tcBorders>
+              <w:top w:val="single" w:color="CCCCCC" w:sz="1"/>
+              <w:left w:val="single" w:color="CCCCCC" w:sz="1"/>
+              <w:bottom w:val="single" w:color="CCCCCC" w:sz="1"/>
+              <w:right w:val="single" w:color="CCCCCC" w:sz="1"/>
+            </w:tcBorders>
+            <w:shd w:fill="F2F6F9" w:val="clear"/>
+            <w:tcMar>
+              <w:top w:type="dxa" w:w="60"/>
+              <w:left w:type="dxa" w:w="120"/>
+              <w:bottom w:type="dxa" w:w="60"/>
+              <w:right w:type="dxa" w:w="120"/>
+            </w:tcMar>
+          </w:tcPr>
+          <w:p>
+            <w:pPr>
+              <w:jc w:val="center"/>
+            </w:pPr>
+            <w:r>
+              <w:rPr>
+                <w:b w:val="false"/>
+                <w:bCs w:val="false"/>
+                <w:color w:val="000000"/>
+                <w:sz w:val="18"/>
+                <w:szCs w:val="18"/>
+              </w:rPr>
+              <w:t xml:space="preserve">74.0%</w:t>
+            </w:r>
+          </w:p>
+        </w:tc>
+        <w:tc>
+          <w:tcPr>
+            <w:tcW w:type="dxa" w:w="1680"/>
+            <w:tcBorders>
+              <w:top w:val="single" w:color="CCCCCC" w:sz="1"/>
+              <w:left w:val="single" w:color="CCCCCC" w:sz="1"/>
+              <w:bottom w:val="single" w:color="CCCCCC" w:sz="1"/>
+              <w:right w:val="single" w:color="CCCCCC" w:sz="1"/>
+            </w:tcBorders>
+            <w:shd w:fill="F2F6F9" w:val="clear"/>
+            <w:tcMar>
+              <w:top w:type="dxa" w:w="60"/>
+              <w:left w:type="dxa" w:w="120"/>
+              <w:bottom w:type="dxa" w:w="60"/>
+              <w:right w:type="dxa" w:w="120"/>
+            </w:tcMar>
+          </w:tcPr>
+          <w:p>
+            <w:pPr>
+              <w:jc w:val="center"/>
+            </w:pPr>
+            <w:r>
+              <w:rPr>
+                <w:b w:val="false"/>
+                <w:bCs w:val="false"/>
+                <w:color w:val="000000"/>
+                <w:sz w:val="18"/>
+                <w:szCs w:val="18"/>
+              </w:rPr>
+              <w:t xml:space="preserve">25.0%</w:t>
+            </w:r>
+          </w:p>
+        </w:tc>
+      </w:tr>
+      <w:tr>
+        <w:tc>
+          <w:tcPr>
+            <w:tcW w:type="dxa" w:w="2640"/>
+            <w:tcBorders>
+              <w:top w:val="single" w:color="CCCCCC" w:sz="1"/>
+              <w:left w:val="single" w:color="CCCCCC" w:sz="1"/>
+              <w:bottom w:val="single" w:color="CCCCCC" w:sz="1"/>
+              <w:right w:val="single" w:color="CCCCCC" w:sz="1"/>
+            </w:tcBorders>
+            <w:shd w:fill="FFFFFF" w:val="clear"/>
+            <w:tcMar>
+              <w:top w:type="dxa" w:w="60"/>
+              <w:left w:type="dxa" w:w="120"/>
+              <w:bottom w:type="dxa" w:w="60"/>
+              <w:right w:type="dxa" w:w="120"/>
+            </w:tcMar>
+          </w:tcPr>
+          <w:p>
+            <w:pPr>
+              <w:jc w:val="left"/>
+            </w:pPr>
+            <w:r>
+              <w:rPr>
+                <w:b w:val="false"/>
+                <w:bCs w:val="false"/>
+                <w:color w:val="000000"/>
+                <w:sz w:val="18"/>
+                <w:szCs w:val="18"/>
+              </w:rPr>
+              <w:t xml:space="preserve">Q3</w:t>
+            </w:r>
+          </w:p>
+        </w:tc>
+        <w:tc>
+          <w:tcPr>
+            <w:tcW w:type="dxa" w:w="1680"/>
+            <w:tcBorders>
+              <w:top w:val="single" w:color="CCCCCC" w:sz="1"/>
+              <w:left w:val="single" w:color="CCCCCC" w:sz="1"/>
+              <w:bottom w:val="single" w:color="CCCCCC" w:sz="1"/>
+              <w:right w:val="single" w:color="CCCCCC" w:sz="1"/>
+            </w:tcBorders>
+            <w:shd w:fill="FFFFFF" w:val="clear"/>
+            <w:tcMar>
+              <w:top w:type="dxa" w:w="60"/>
+              <w:left w:type="dxa" w:w="120"/>
+              <w:bottom w:type="dxa" w:w="60"/>
+              <w:right w:type="dxa" w:w="120"/>
+            </w:tcMar>
+          </w:tcPr>
+          <w:p>
+            <w:pPr>
+              <w:jc w:val="center"/>
+            </w:pPr>
+            <w:r>
+              <w:rPr>
+                <w:b w:val="false"/>
+                <w:bCs w:val="false"/>
+                <w:color w:val="000000"/>
+                <w:sz w:val="18"/>
+                <w:szCs w:val="18"/>
+              </w:rPr>
+              <w:t xml:space="preserve">92.1%</w:t>
+            </w:r>
+          </w:p>
+        </w:tc>
+        <w:tc>
+          <w:tcPr>
+            <w:tcW w:type="dxa" w:w="1680"/>
+            <w:tcBorders>
+              <w:top w:val="single" w:color="CCCCCC" w:sz="1"/>
+              <w:left w:val="single" w:color="CCCCCC" w:sz="1"/>
+              <w:bottom w:val="single" w:color="CCCCCC" w:sz="1"/>
+              <w:right w:val="single" w:color="CCCCCC" w:sz="1"/>
+            </w:tcBorders>
+            <w:shd w:fill="FFFFFF" w:val="clear"/>
+            <w:tcMar>
+              <w:top w:type="dxa" w:w="60"/>
+              <w:left w:type="dxa" w:w="120"/>
+              <w:bottom w:type="dxa" w:w="60"/>
+              <w:right w:type="dxa" w:w="120"/>
+            </w:tcMar>
+          </w:tcPr>
+          <w:p>
+            <w:pPr>
+              <w:jc w:val="center"/>
+            </w:pPr>
+            <w:r>
+              <w:rPr>
+                <w:b w:val="false"/>
+                <w:bCs w:val="false"/>
+                <w:color w:val="000000"/>
+                <w:sz w:val="18"/>
+                <w:szCs w:val="18"/>
+              </w:rPr>
+              <w:t xml:space="preserve">90.2%</w:t>
+            </w:r>
+          </w:p>
+        </w:tc>
+        <w:tc>
+          <w:tcPr>
+            <w:tcW w:type="dxa" w:w="1680"/>
+            <w:tcBorders>
+              <w:top w:val="single" w:color="CCCCCC" w:sz="1"/>
+              <w:left w:val="single" w:color="CCCCCC" w:sz="1"/>
+              <w:bottom w:val="single" w:color="CCCCCC" w:sz="1"/>
+              <w:right w:val="single" w:color="CCCCCC" w:sz="1"/>
+            </w:tcBorders>
+            <w:shd w:fill="FFFFFF" w:val="clear"/>
+            <w:tcMar>
+              <w:top w:type="dxa" w:w="60"/>
+              <w:left w:type="dxa" w:w="120"/>
+              <w:bottom w:type="dxa" w:w="60"/>
+              <w:right w:type="dxa" w:w="120"/>
+            </w:tcMar>
+          </w:tcPr>
+          <w:p>
+            <w:pPr>
+              <w:jc w:val="center"/>
+            </w:pPr>
+            <w:r>
+              <w:rPr>
+                <w:b w:val="false"/>
+                <w:bCs w:val="false"/>
+                <w:color w:val="000000"/>
+                <w:sz w:val="18"/>
+                <w:szCs w:val="18"/>
+              </w:rPr>
+              <w:t xml:space="preserve">72.0%</w:t>
+            </w:r>
+          </w:p>
+        </w:tc>
+        <w:tc>
+          <w:tcPr>
+            <w:tcW w:type="dxa" w:w="1680"/>
+            <w:tcBorders>
+              <w:top w:val="single" w:color="CCCCCC" w:sz="1"/>
+              <w:left w:val="single" w:color="CCCCCC" w:sz="1"/>
+              <w:bottom w:val="single" w:color="CCCCCC" w:sz="1"/>
+              <w:right w:val="single" w:color="CCCCCC" w:sz="1"/>
+            </w:tcBorders>
+            <w:shd w:fill="FFFFFF" w:val="clear"/>
+            <w:tcMar>
+              <w:top w:type="dxa" w:w="60"/>
+              <w:left w:type="dxa" w:w="120"/>
+              <w:bottom w:type="dxa" w:w="60"/>
+              <w:right w:type="dxa" w:w="120"/>
+            </w:tcMar>
+          </w:tcPr>
+          <w:p>
+            <w:pPr>
+              <w:jc w:val="center"/>
+            </w:pPr>
+            <w:r>
+              <w:rPr>
+                <w:b w:val="false"/>
+                <w:bCs w:val="false"/>
+                <w:color w:val="000000"/>
+                <w:sz w:val="18"/>
+                <w:szCs w:val="18"/>
+              </w:rPr>
+              <w:t xml:space="preserve">30.8%</w:t>
+            </w:r>
+          </w:p>
+        </w:tc>
+      </w:tr>
+      <w:tr>
+        <w:tc>
+          <w:tcPr>
+            <w:tcW w:type="dxa" w:w="2640"/>
+            <w:tcBorders>
+              <w:top w:val="single" w:color="CCCCCC" w:sz="1"/>
+              <w:left w:val="single" w:color="CCCCCC" w:sz="1"/>
+              <w:bottom w:val="single" w:color="CCCCCC" w:sz="1"/>
+              <w:right w:val="single" w:color="CCCCCC" w:sz="1"/>
+            </w:tcBorders>
+            <w:shd w:fill="F2F6F9" w:val="clear"/>
+            <w:tcMar>
+              <w:top w:type="dxa" w:w="60"/>
+              <w:left w:type="dxa" w:w="120"/>
+              <w:bottom w:type="dxa" w:w="60"/>
+              <w:right w:type="dxa" w:w="120"/>
+            </w:tcMar>
+          </w:tcPr>
+          <w:p>
+            <w:pPr>
+              <w:jc w:val="left"/>
+            </w:pPr>
+            <w:r>
+              <w:rPr>
+                <w:b w:val="false"/>
+                <w:bCs w:val="false"/>
+                <w:color w:val="000000"/>
+                <w:sz w:val="18"/>
+                <w:szCs w:val="18"/>
+              </w:rPr>
+              <w:t xml:space="preserve">Q4</w:t>
+            </w:r>
+          </w:p>
+        </w:tc>
+        <w:tc>
+          <w:tcPr>
+            <w:tcW w:type="dxa" w:w="1680"/>
+            <w:tcBorders>
+              <w:top w:val="single" w:color="CCCCCC" w:sz="1"/>
+              <w:left w:val="single" w:color="CCCCCC" w:sz="1"/>
+              <w:bottom w:val="single" w:color="CCCCCC" w:sz="1"/>
+              <w:right w:val="single" w:color="CCCCCC" w:sz="1"/>
+            </w:tcBorders>
+            <w:shd w:fill="F2F6F9" w:val="clear"/>
+            <w:tcMar>
+              <w:top w:type="dxa" w:w="60"/>
+              <w:left w:type="dxa" w:w="120"/>
+              <w:bottom w:type="dxa" w:w="60"/>
+              <w:right w:type="dxa" w:w="120"/>
+            </w:tcMar>
+          </w:tcPr>
+          <w:p>
+            <w:pPr>
+              <w:jc w:val="center"/>
+            </w:pPr>
+            <w:r>
+              <w:rPr>
+                <w:b w:val="false"/>
+                <w:bCs w:val="false"/>
+                <w:color w:val="000000"/>
+                <w:sz w:val="18"/>
+                <w:szCs w:val="18"/>
+              </w:rPr>
+              <w:t xml:space="preserve">94.3%</w:t>
+            </w:r>
+          </w:p>
+        </w:tc>
+        <w:tc>
+          <w:tcPr>
+            <w:tcW w:type="dxa" w:w="1680"/>
+            <w:tcBorders>
+              <w:top w:val="single" w:color="CCCCCC" w:sz="1"/>
+              <w:left w:val="single" w:color="CCCCCC" w:sz="1"/>
+              <w:bottom w:val="single" w:color="CCCCCC" w:sz="1"/>
+              <w:right w:val="single" w:color="CCCCCC" w:sz="1"/>
+            </w:tcBorders>
+            <w:shd w:fill="F2F6F9" w:val="clear"/>
+            <w:tcMar>
+              <w:top w:type="dxa" w:w="60"/>
+              <w:left w:type="dxa" w:w="120"/>
+              <w:bottom w:type="dxa" w:w="60"/>
+              <w:right w:type="dxa" w:w="120"/>
+            </w:tcMar>
+          </w:tcPr>
+          <w:p>
+            <w:pPr>
+              <w:jc w:val="center"/>
+            </w:pPr>
+            <w:r>
+              <w:rPr>
+                <w:b w:val="false"/>
+                <w:bCs w:val="false"/>
+                <w:color w:val="000000"/>
+                <w:sz w:val="18"/>
+                <w:szCs w:val="18"/>
+              </w:rPr>
+              <w:t xml:space="preserve">90.9%</w:t>
+            </w:r>
+          </w:p>
+        </w:tc>
+        <w:tc>
+          <w:tcPr>
+            <w:tcW w:type="dxa" w:w="1680"/>
+            <w:tcBorders>
+              <w:top w:val="single" w:color="CCCCCC" w:sz="1"/>
+              <w:left w:val="single" w:color="CCCCCC" w:sz="1"/>
+              <w:bottom w:val="single" w:color="CCCCCC" w:sz="1"/>
+              <w:right w:val="single" w:color="CCCCCC" w:sz="1"/>
+            </w:tcBorders>
+            <w:shd w:fill="F2F6F9" w:val="clear"/>
+            <w:tcMar>
+              <w:top w:type="dxa" w:w="60"/>
+              <w:left w:type="dxa" w:w="120"/>
+              <w:bottom w:type="dxa" w:w="60"/>
+              <w:right w:type="dxa" w:w="120"/>
+            </w:tcMar>
+          </w:tcPr>
+          <w:p>
+            <w:pPr>
+              <w:jc w:val="center"/>
+            </w:pPr>
+            <w:r>
+              <w:rPr>
+                <w:b w:val="false"/>
+                <w:bCs w:val="false"/>
+                <w:color w:val="000000"/>
+                <w:sz w:val="18"/>
+                <w:szCs w:val="18"/>
+              </w:rPr>
+              <w:t xml:space="preserve">78.7%</w:t>
+            </w:r>
+          </w:p>
+        </w:tc>
+        <w:tc>
+          <w:tcPr>
+            <w:tcW w:type="dxa" w:w="1680"/>
+            <w:tcBorders>
+              <w:top w:val="single" w:color="CCCCCC" w:sz="1"/>
+              <w:left w:val="single" w:color="CCCCCC" w:sz="1"/>
+              <w:bottom w:val="single" w:color="CCCCCC" w:sz="1"/>
+              <w:right w:val="single" w:color="CCCCCC" w:sz="1"/>
+            </w:tcBorders>
+            <w:shd w:fill="F2F6F9" w:val="clear"/>
+            <w:tcMar>
+              <w:top w:type="dxa" w:w="60"/>
+              <w:left w:type="dxa" w:w="120"/>
+              <w:bottom w:type="dxa" w:w="60"/>
+              <w:right w:type="dxa" w:w="120"/>
+            </w:tcMar>
+          </w:tcPr>
+          <w:p>
+            <w:pPr>
+              <w:jc w:val="center"/>
+            </w:pPr>
+            <w:r>
+              <w:rPr>
+                <w:b w:val="false"/>
+                <w:bCs w:val="false"/>
+                <w:color w:val="000000"/>
+                <w:sz w:val="18"/>
+                <w:szCs w:val="18"/>
+              </w:rPr>
+              <w:t xml:space="preserve">21.1%</w:t>
+            </w:r>
+          </w:p>
+        </w:tc>
+      </w:tr>
+      <w:tr>
+        <w:tc>
+          <w:tcPr>
+            <w:tcW w:type="dxa" w:w="2640"/>
+            <w:tcBorders>
+              <w:top w:val="single" w:color="CCCCCC" w:sz="1"/>
+              <w:left w:val="single" w:color="CCCCCC" w:sz="1"/>
+              <w:bottom w:val="single" w:color="CCCCCC" w:sz="1"/>
+              <w:right w:val="single" w:color="CCCCCC" w:sz="1"/>
+            </w:tcBorders>
+            <w:shd w:fill="FFFFFF" w:val="clear"/>
+            <w:tcMar>
+              <w:top w:type="dxa" w:w="60"/>
+              <w:left w:type="dxa" w:w="120"/>
+              <w:bottom w:type="dxa" w:w="60"/>
+              <w:right w:type="dxa" w:w="120"/>
+            </w:tcMar>
+          </w:tcPr>
+          <w:p>
+            <w:pPr>
+              <w:jc w:val="left"/>
+            </w:pPr>
+            <w:r>
+              <w:rPr>
+                <w:b w:val="false"/>
+                <w:bCs w:val="false"/>
+                <w:color w:val="000000"/>
+                <w:sz w:val="18"/>
+                <w:szCs w:val="18"/>
+              </w:rPr>
+              <w:t xml:space="preserve">Q5 (richest)</w:t>
+            </w:r>
+          </w:p>
+        </w:tc>
+        <w:tc>
+          <w:tcPr>
+            <w:tcW w:type="dxa" w:w="1680"/>
+            <w:tcBorders>
+              <w:top w:val="single" w:color="CCCCCC" w:sz="1"/>
+              <w:left w:val="single" w:color="CCCCCC" w:sz="1"/>
+              <w:bottom w:val="single" w:color="CCCCCC" w:sz="1"/>
+              <w:right w:val="single" w:color="CCCCCC" w:sz="1"/>
+            </w:tcBorders>
+            <w:shd w:fill="FFFFFF" w:val="clear"/>
+            <w:tcMar>
+              <w:top w:type="dxa" w:w="60"/>
+              <w:left w:type="dxa" w:w="120"/>
+              <w:bottom w:type="dxa" w:w="60"/>
+              <w:right w:type="dxa" w:w="120"/>
+            </w:tcMar>
+          </w:tcPr>
+          <w:p>
+            <w:pPr>
+              <w:jc w:val="center"/>
+            </w:pPr>
+            <w:r>
+              <w:rPr>
+                <w:b w:val="false"/>
+                <w:bCs w:val="false"/>
+                <w:color w:val="000000"/>
+                <w:sz w:val="18"/>
+                <w:szCs w:val="18"/>
+              </w:rPr>
+              <w:t xml:space="preserve">91.2%</w:t>
+            </w:r>
+          </w:p>
+        </w:tc>
+        <w:tc>
+          <w:tcPr>
+            <w:tcW w:type="dxa" w:w="1680"/>
+            <w:tcBorders>
+              <w:top w:val="single" w:color="CCCCCC" w:sz="1"/>
+              <w:left w:val="single" w:color="CCCCCC" w:sz="1"/>
+              <w:bottom w:val="single" w:color="CCCCCC" w:sz="1"/>
+              <w:right w:val="single" w:color="CCCCCC" w:sz="1"/>
+            </w:tcBorders>
+            <w:shd w:fill="FFFFFF" w:val="clear"/>
+            <w:tcMar>
+              <w:top w:type="dxa" w:w="60"/>
+              <w:left w:type="dxa" w:w="120"/>
+              <w:bottom w:type="dxa" w:w="60"/>
+              <w:right w:type="dxa" w:w="120"/>
+            </w:tcMar>
+          </w:tcPr>
+          <w:p>
+            <w:pPr>
+              <w:jc w:val="center"/>
+            </w:pPr>
+            <w:r>
+              <w:rPr>
+                <w:b w:val="false"/>
+                <w:bCs w:val="false"/>
+                <w:color w:val="000000"/>
+                <w:sz w:val="18"/>
+                <w:szCs w:val="18"/>
+              </w:rPr>
+              <w:t xml:space="preserve">89.3%</w:t>
+            </w:r>
+          </w:p>
+        </w:tc>
+        <w:tc>
+          <w:tcPr>
+            <w:tcW w:type="dxa" w:w="1680"/>
+            <w:tcBorders>
+              <w:top w:val="single" w:color="CCCCCC" w:sz="1"/>
+              <w:left w:val="single" w:color="CCCCCC" w:sz="1"/>
+              <w:bottom w:val="single" w:color="CCCCCC" w:sz="1"/>
+              <w:right w:val="single" w:color="CCCCCC" w:sz="1"/>
+            </w:tcBorders>
+            <w:shd w:fill="FFFFFF" w:val="clear"/>
+            <w:tcMar>
+              <w:top w:type="dxa" w:w="60"/>
+              <w:left w:type="dxa" w:w="120"/>
+              <w:bottom w:type="dxa" w:w="60"/>
+              <w:right w:type="dxa" w:w="120"/>
+            </w:tcMar>
+          </w:tcPr>
+          <w:p>
+            <w:pPr>
+              <w:jc w:val="center"/>
+            </w:pPr>
+            <w:r>
+              <w:rPr>
+                <w:b w:val="false"/>
+                <w:bCs w:val="false"/>
+                <w:color w:val="000000"/>
+                <w:sz w:val="18"/>
+                <w:szCs w:val="18"/>
+              </w:rPr>
+              <w:t xml:space="preserve">76.0%</w:t>
+            </w:r>
+          </w:p>
+        </w:tc>
+        <w:tc>
+          <w:tcPr>
+            <w:tcW w:type="dxa" w:w="1680"/>
+            <w:tcBorders>
+              <w:top w:val="single" w:color="CCCCCC" w:sz="1"/>
+              <w:left w:val="single" w:color="CCCCCC" w:sz="1"/>
+              <w:bottom w:val="single" w:color="CCCCCC" w:sz="1"/>
+              <w:right w:val="single" w:color="CCCCCC" w:sz="1"/>
+            </w:tcBorders>
+            <w:shd w:fill="FFFFFF" w:val="clear"/>
+            <w:tcMar>
+              <w:top w:type="dxa" w:w="60"/>
+              <w:left w:type="dxa" w:w="120"/>
+              <w:bottom w:type="dxa" w:w="60"/>
+              <w:right w:type="dxa" w:w="120"/>
+            </w:tcMar>
+          </w:tcPr>
+          <w:p>
+            <w:pPr>
+              <w:jc w:val="center"/>
+            </w:pPr>
+            <w:r>
+              <w:rPr>
+                <w:b w:val="false"/>
+                <w:bCs w:val="false"/>
+                <w:color w:val="000000"/>
+                <w:sz w:val="18"/>
+                <w:szCs w:val="18"/>
+              </w:rPr>
+              <w:t xml:space="preserve">25.5%</w:t>
+            </w:r>
+          </w:p>
+        </w:tc>
+      </w:tr>
+    </w:tbl>
+    <w:p>
+      <w:pPr>
+        <w:spacing w:after="120" w:before="120"/>
+      </w:pPr>
+      <w:r>
+        <w:rPr>
+          <w:b/>
+          <w:bCs/>
+          <w:sz w:val="20"/>
+          <w:szCs w:val="20"/>
+        </w:rPr>
+        <w:t xml:space="preserve">Geographically, concern is again broad. </w:t>
+      </w:r>
+      <w:r>
+        <w:rPr>
+          <w:sz w:val="20"/>
+          <w:szCs w:val="20"/>
+        </w:rPr>
+        <w:t xml:space="preserve">It is marginally lower in the National Capital Region (90.6 percent) than in the rest of Luzon, the Visayas, and Mindanao (around 93–94 percent). Confidence that the government is doing enough is lowest in the Visayas (22.7 percent) and Mindanao (20.5 percent).</w:t>
+      </w:r>
+    </w:p>
+    <w:tbl>
+      <w:tblPr>
+        <w:tblW w:type="dxa" w:w="9360"/>
+        <w:tblBorders>
+          <w:top w:val="single" w:color="auto" w:sz="4"/>
+          <w:left w:val="single" w:color="auto" w:sz="4"/>
+          <w:bottom w:val="single" w:color="auto" w:sz="4"/>
+          <w:right w:val="single" w:color="auto" w:sz="4"/>
+          <w:insideH w:val="single" w:color="auto" w:sz="4"/>
+          <w:insideV w:val="single" w:color="auto" w:sz="4"/>
+        </w:tblBorders>
+      </w:tblPr>
+      <w:tblGrid>
+        <w:gridCol w:w="2640"/>
+        <w:gridCol w:w="2240"/>
+        <w:gridCol w:w="2240"/>
+        <w:gridCol w:w="2240"/>
+      </w:tblGrid>
+      <w:tr>
+        <w:trPr>
+          <w:tblHeader/>
+        </w:trPr>
+        <w:tc>
+          <w:tcPr>
+            <w:tcW w:type="dxa" w:w="2640"/>
+            <w:tcBorders>
+              <w:top w:val="single" w:color="CCCCCC" w:sz="1"/>
+              <w:left w:val="single" w:color="CCCCCC" w:sz="1"/>
+              <w:bottom w:val="single" w:color="CCCCCC" w:sz="1"/>
+              <w:right w:val="single" w:color="CCCCCC" w:sz="1"/>
+            </w:tcBorders>
+            <w:shd w:fill="009FDA" w:val="clear"/>
+            <w:tcMar>
+              <w:top w:type="dxa" w:w="60"/>
+              <w:left w:type="dxa" w:w="120"/>
+              <w:bottom w:type="dxa" w:w="60"/>
+              <w:right w:type="dxa" w:w="120"/>
+            </w:tcMar>
+          </w:tcPr>
+          <w:p>
+            <w:pPr>
+              <w:jc w:val="left"/>
+            </w:pPr>
+            <w:r>
+              <w:rPr>
+                <w:b/>
+                <w:bCs/>
+                <w:color w:val="FFFFFF"/>
+                <w:sz w:val="18"/>
+                <w:szCs w:val="18"/>
+              </w:rPr>
+              <w:t xml:space="preserve">Region</w:t>
+            </w:r>
+          </w:p>
+        </w:tc>
+        <w:tc>
+          <w:tcPr>
+            <w:tcW w:type="dxa" w:w="2240"/>
+            <w:tcBorders>
+              <w:top w:val="single" w:color="CCCCCC" w:sz="1"/>
+              <w:left w:val="single" w:color="CCCCCC" w:sz="1"/>
+              <w:bottom w:val="single" w:color="CCCCCC" w:sz="1"/>
+              <w:right w:val="single" w:color="CCCCCC" w:sz="1"/>
+            </w:tcBorders>
+            <w:shd w:fill="009FDA" w:val="clear"/>
+            <w:tcMar>
+              <w:top w:type="dxa" w:w="60"/>
+              <w:left w:type="dxa" w:w="120"/>
+              <w:bottom w:type="dxa" w:w="60"/>
+              <w:right w:type="dxa" w:w="120"/>
+            </w:tcMar>
+          </w:tcPr>
+          <w:p>
+            <w:pPr>
+              <w:jc w:val="center"/>
+            </w:pPr>
+            <w:r>
+              <w:rPr>
+                <w:b/>
+                <w:bCs/>
+                <w:color w:val="FFFFFF"/>
+                <w:sz w:val="18"/>
+                <w:szCs w:val="18"/>
+              </w:rPr>
+              <w:t xml:space="preserve">Concerned</w:t>
+            </w:r>
+          </w:p>
+        </w:tc>
+        <w:tc>
+          <w:tcPr>
+            <w:tcW w:type="dxa" w:w="2240"/>
+            <w:tcBorders>
+              <w:top w:val="single" w:color="CCCCCC" w:sz="1"/>
+              <w:left w:val="single" w:color="CCCCCC" w:sz="1"/>
+              <w:bottom w:val="single" w:color="CCCCCC" w:sz="1"/>
+              <w:right w:val="single" w:color="CCCCCC" w:sz="1"/>
+            </w:tcBorders>
+            <w:shd w:fill="009FDA" w:val="clear"/>
+            <w:tcMar>
+              <w:top w:type="dxa" w:w="60"/>
+              <w:left w:type="dxa" w:w="120"/>
+              <w:bottom w:type="dxa" w:w="60"/>
+              <w:right w:type="dxa" w:w="120"/>
+            </w:tcMar>
+          </w:tcPr>
+          <w:p>
+            <w:pPr>
+              <w:jc w:val="center"/>
+            </w:pPr>
+            <w:r>
+              <w:rPr>
+                <w:b/>
+                <w:bCs/>
+                <w:color w:val="FFFFFF"/>
+                <w:sz w:val="18"/>
+                <w:szCs w:val="18"/>
+              </w:rPr>
+              <w:t xml:space="preserve">Severe/mod. impact</w:t>
+            </w:r>
+          </w:p>
+        </w:tc>
+        <w:tc>
+          <w:tcPr>
+            <w:tcW w:type="dxa" w:w="2240"/>
+            <w:tcBorders>
+              <w:top w:val="single" w:color="CCCCCC" w:sz="1"/>
+              <w:left w:val="single" w:color="CCCCCC" w:sz="1"/>
+              <w:bottom w:val="single" w:color="CCCCCC" w:sz="1"/>
+              <w:right w:val="single" w:color="CCCCCC" w:sz="1"/>
+            </w:tcBorders>
+            <w:shd w:fill="009FDA" w:val="clear"/>
+            <w:tcMar>
+              <w:top w:type="dxa" w:w="60"/>
+              <w:left w:type="dxa" w:w="120"/>
+              <w:bottom w:type="dxa" w:w="60"/>
+              <w:right w:type="dxa" w:w="120"/>
+            </w:tcMar>
+          </w:tcPr>
+          <w:p>
+            <w:pPr>
+              <w:jc w:val="center"/>
+            </w:pPr>
+            <w:r>
+              <w:rPr>
+                <w:b/>
+                <w:bCs/>
+                <w:color w:val="FFFFFF"/>
+                <w:sz w:val="18"/>
+                <w:szCs w:val="18"/>
+              </w:rPr>
+              <w:t xml:space="preserve">Govt doing enough</w:t>
+            </w:r>
+          </w:p>
+        </w:tc>
+      </w:tr>
+      <w:tr>
+        <w:tc>
+          <w:tcPr>
+            <w:tcW w:type="dxa" w:w="2640"/>
+            <w:tcBorders>
+              <w:top w:val="single" w:color="CCCCCC" w:sz="1"/>
+              <w:left w:val="single" w:color="CCCCCC" w:sz="1"/>
+              <w:bottom w:val="single" w:color="CCCCCC" w:sz="1"/>
+              <w:right w:val="single" w:color="CCCCCC" w:sz="1"/>
+            </w:tcBorders>
+            <w:shd w:fill="FFFFFF" w:val="clear"/>
+            <w:tcMar>
+              <w:top w:type="dxa" w:w="60"/>
+              <w:left w:type="dxa" w:w="120"/>
+              <w:bottom w:type="dxa" w:w="60"/>
+              <w:right w:type="dxa" w:w="120"/>
+            </w:tcMar>
+          </w:tcPr>
+          <w:p>
+            <w:pPr>
+              <w:jc w:val="left"/>
+            </w:pPr>
+            <w:r>
+              <w:rPr>
+                <w:b w:val="false"/>
+                <w:bCs w:val="false"/>
+                <w:color w:val="000000"/>
+                <w:sz w:val="18"/>
+                <w:szCs w:val="18"/>
+              </w:rPr>
+              <w:t xml:space="preserve">NCR</w:t>
+            </w:r>
+          </w:p>
+        </w:tc>
+        <w:tc>
+          <w:tcPr>
+            <w:tcW w:type="dxa" w:w="2240"/>
+            <w:tcBorders>
+              <w:top w:val="single" w:color="CCCCCC" w:sz="1"/>
+              <w:left w:val="single" w:color="CCCCCC" w:sz="1"/>
+              <w:bottom w:val="single" w:color="CCCCCC" w:sz="1"/>
+              <w:right w:val="single" w:color="CCCCCC" w:sz="1"/>
+            </w:tcBorders>
+            <w:shd w:fill="FFFFFF" w:val="clear"/>
+            <w:tcMar>
+              <w:top w:type="dxa" w:w="60"/>
+              <w:left w:type="dxa" w:w="120"/>
+              <w:bottom w:type="dxa" w:w="60"/>
+              <w:right w:type="dxa" w:w="120"/>
+            </w:tcMar>
+          </w:tcPr>
+          <w:p>
+            <w:pPr>
+              <w:jc w:val="center"/>
+            </w:pPr>
+            <w:r>
+              <w:rPr>
+                <w:b w:val="false"/>
+                <w:bCs w:val="false"/>
+                <w:color w:val="000000"/>
+                <w:sz w:val="18"/>
+                <w:szCs w:val="18"/>
+              </w:rPr>
+              <w:t xml:space="preserve">90.6%</w:t>
+            </w:r>
+          </w:p>
+        </w:tc>
+        <w:tc>
+          <w:tcPr>
+            <w:tcW w:type="dxa" w:w="2240"/>
+            <w:tcBorders>
+              <w:top w:val="single" w:color="CCCCCC" w:sz="1"/>
+              <w:left w:val="single" w:color="CCCCCC" w:sz="1"/>
+              <w:bottom w:val="single" w:color="CCCCCC" w:sz="1"/>
+              <w:right w:val="single" w:color="CCCCCC" w:sz="1"/>
+            </w:tcBorders>
+            <w:shd w:fill="FFFFFF" w:val="clear"/>
+            <w:tcMar>
+              <w:top w:type="dxa" w:w="60"/>
+              <w:left w:type="dxa" w:w="120"/>
+              <w:bottom w:type="dxa" w:w="60"/>
+              <w:right w:type="dxa" w:w="120"/>
+            </w:tcMar>
+          </w:tcPr>
+          <w:p>
+            <w:pPr>
+              <w:jc w:val="center"/>
+            </w:pPr>
+            <w:r>
+              <w:rPr>
+                <w:b w:val="false"/>
+                <w:bCs w:val="false"/>
+                <w:color w:val="000000"/>
+                <w:sz w:val="18"/>
+                <w:szCs w:val="18"/>
+              </w:rPr>
+              <w:t xml:space="preserve">90.1%</w:t>
+            </w:r>
+          </w:p>
+        </w:tc>
+        <w:tc>
+          <w:tcPr>
+            <w:tcW w:type="dxa" w:w="2240"/>
+            <w:tcBorders>
+              <w:top w:val="single" w:color="CCCCCC" w:sz="1"/>
+              <w:left w:val="single" w:color="CCCCCC" w:sz="1"/>
+              <w:bottom w:val="single" w:color="CCCCCC" w:sz="1"/>
+              <w:right w:val="single" w:color="CCCCCC" w:sz="1"/>
+            </w:tcBorders>
+            <w:shd w:fill="FFFFFF" w:val="clear"/>
+            <w:tcMar>
+              <w:top w:type="dxa" w:w="60"/>
+              <w:left w:type="dxa" w:w="120"/>
+              <w:bottom w:type="dxa" w:w="60"/>
+              <w:right w:type="dxa" w:w="120"/>
+            </w:tcMar>
+          </w:tcPr>
+          <w:p>
+            <w:pPr>
+              <w:jc w:val="center"/>
+            </w:pPr>
+            <w:r>
+              <w:rPr>
+                <w:b w:val="false"/>
+                <w:bCs w:val="false"/>
+                <w:color w:val="000000"/>
+                <w:sz w:val="18"/>
+                <w:szCs w:val="18"/>
+              </w:rPr>
+              <w:t xml:space="preserve">26.7%</w:t>
+            </w:r>
+          </w:p>
+        </w:tc>
+      </w:tr>
+      <w:tr>
+        <w:tc>
+          <w:tcPr>
+            <w:tcW w:type="dxa" w:w="2640"/>
+            <w:tcBorders>
+              <w:top w:val="single" w:color="CCCCCC" w:sz="1"/>
+              <w:left w:val="single" w:color="CCCCCC" w:sz="1"/>
+              <w:bottom w:val="single" w:color="CCCCCC" w:sz="1"/>
+              <w:right w:val="single" w:color="CCCCCC" w:sz="1"/>
+            </w:tcBorders>
+            <w:shd w:fill="F2F6F9" w:val="clear"/>
+            <w:tcMar>
+              <w:top w:type="dxa" w:w="60"/>
+              <w:left w:type="dxa" w:w="120"/>
+              <w:bottom w:type="dxa" w:w="60"/>
+              <w:right w:type="dxa" w:w="120"/>
+            </w:tcMar>
+          </w:tcPr>
+          <w:p>
+            <w:pPr>
+              <w:jc w:val="left"/>
+            </w:pPr>
+            <w:r>
+              <w:rPr>
+                <w:b w:val="false"/>
+                <w:bCs w:val="false"/>
+                <w:color w:val="000000"/>
+                <w:sz w:val="18"/>
+                <w:szCs w:val="18"/>
+              </w:rPr>
+              <w:t xml:space="preserve">Luzon (ex-NCR)</w:t>
+            </w:r>
+          </w:p>
+        </w:tc>
+        <w:tc>
+          <w:tcPr>
+            <w:tcW w:type="dxa" w:w="2240"/>
+            <w:tcBorders>
+              <w:top w:val="single" w:color="CCCCCC" w:sz="1"/>
+              <w:left w:val="single" w:color="CCCCCC" w:sz="1"/>
+              <w:bottom w:val="single" w:color="CCCCCC" w:sz="1"/>
+              <w:right w:val="single" w:color="CCCCCC" w:sz="1"/>
+            </w:tcBorders>
+            <w:shd w:fill="F2F6F9" w:val="clear"/>
+            <w:tcMar>
+              <w:top w:type="dxa" w:w="60"/>
+              <w:left w:type="dxa" w:w="120"/>
+              <w:bottom w:type="dxa" w:w="60"/>
+              <w:right w:type="dxa" w:w="120"/>
+            </w:tcMar>
+          </w:tcPr>
+          <w:p>
+            <w:pPr>
+              <w:jc w:val="center"/>
+            </w:pPr>
+            <w:r>
+              <w:rPr>
+                <w:b w:val="false"/>
+                <w:bCs w:val="false"/>
+                <w:color w:val="000000"/>
+                <w:sz w:val="18"/>
+                <w:szCs w:val="18"/>
+              </w:rPr>
+              <w:t xml:space="preserve">93.0%</w:t>
+            </w:r>
+          </w:p>
+        </w:tc>
+        <w:tc>
+          <w:tcPr>
+            <w:tcW w:type="dxa" w:w="2240"/>
+            <w:tcBorders>
+              <w:top w:val="single" w:color="CCCCCC" w:sz="1"/>
+              <w:left w:val="single" w:color="CCCCCC" w:sz="1"/>
+              <w:bottom w:val="single" w:color="CCCCCC" w:sz="1"/>
+              <w:right w:val="single" w:color="CCCCCC" w:sz="1"/>
+            </w:tcBorders>
+            <w:shd w:fill="F2F6F9" w:val="clear"/>
+            <w:tcMar>
+              <w:top w:type="dxa" w:w="60"/>
+              <w:left w:type="dxa" w:w="120"/>
+              <w:bottom w:type="dxa" w:w="60"/>
+              <w:right w:type="dxa" w:w="120"/>
+            </w:tcMar>
+          </w:tcPr>
+          <w:p>
+            <w:pPr>
+              <w:jc w:val="center"/>
+            </w:pPr>
+            <w:r>
+              <w:rPr>
+                <w:b w:val="false"/>
+                <w:bCs w:val="false"/>
+                <w:color w:val="000000"/>
+                <w:sz w:val="18"/>
+                <w:szCs w:val="18"/>
+              </w:rPr>
+              <w:t xml:space="preserve">89.9%</w:t>
+            </w:r>
+          </w:p>
+        </w:tc>
+        <w:tc>
+          <w:tcPr>
+            <w:tcW w:type="dxa" w:w="2240"/>
+            <w:tcBorders>
+              <w:top w:val="single" w:color="CCCCCC" w:sz="1"/>
+              <w:left w:val="single" w:color="CCCCCC" w:sz="1"/>
+              <w:bottom w:val="single" w:color="CCCCCC" w:sz="1"/>
+              <w:right w:val="single" w:color="CCCCCC" w:sz="1"/>
+            </w:tcBorders>
+            <w:shd w:fill="F2F6F9" w:val="clear"/>
+            <w:tcMar>
+              <w:top w:type="dxa" w:w="60"/>
+              <w:left w:type="dxa" w:w="120"/>
+              <w:bottom w:type="dxa" w:w="60"/>
+              <w:right w:type="dxa" w:w="120"/>
+            </w:tcMar>
+          </w:tcPr>
+          <w:p>
+            <w:pPr>
+              <w:jc w:val="center"/>
+            </w:pPr>
+            <w:r>
+              <w:rPr>
+                <w:b w:val="false"/>
+                <w:bCs w:val="false"/>
+                <w:color w:val="000000"/>
+                <w:sz w:val="18"/>
+                <w:szCs w:val="18"/>
+              </w:rPr>
+              <w:t xml:space="preserve">28.5%</w:t>
+            </w:r>
+          </w:p>
+        </w:tc>
+      </w:tr>
+      <w:tr>
+        <w:tc>
+          <w:tcPr>
+            <w:tcW w:type="dxa" w:w="2640"/>
+            <w:tcBorders>
+              <w:top w:val="single" w:color="CCCCCC" w:sz="1"/>
+              <w:left w:val="single" w:color="CCCCCC" w:sz="1"/>
+              <w:bottom w:val="single" w:color="CCCCCC" w:sz="1"/>
+              <w:right w:val="single" w:color="CCCCCC" w:sz="1"/>
+            </w:tcBorders>
+            <w:shd w:fill="FFFFFF" w:val="clear"/>
+            <w:tcMar>
+              <w:top w:type="dxa" w:w="60"/>
+              <w:left w:type="dxa" w:w="120"/>
+              <w:bottom w:type="dxa" w:w="60"/>
+              <w:right w:type="dxa" w:w="120"/>
+            </w:tcMar>
+          </w:tcPr>
+          <w:p>
+            <w:pPr>
+              <w:jc w:val="left"/>
+            </w:pPr>
+            <w:r>
+              <w:rPr>
+                <w:b w:val="false"/>
+                <w:bCs w:val="false"/>
+                <w:color w:val="000000"/>
+                <w:sz w:val="18"/>
+                <w:szCs w:val="18"/>
+              </w:rPr>
+              <w:t xml:space="preserve">Visayas</w:t>
+            </w:r>
+          </w:p>
+        </w:tc>
+        <w:tc>
+          <w:tcPr>
+            <w:tcW w:type="dxa" w:w="2240"/>
+            <w:tcBorders>
+              <w:top w:val="single" w:color="CCCCCC" w:sz="1"/>
+              <w:left w:val="single" w:color="CCCCCC" w:sz="1"/>
+              <w:bottom w:val="single" w:color="CCCCCC" w:sz="1"/>
+              <w:right w:val="single" w:color="CCCCCC" w:sz="1"/>
+            </w:tcBorders>
+            <w:shd w:fill="FFFFFF" w:val="clear"/>
+            <w:tcMar>
+              <w:top w:type="dxa" w:w="60"/>
+              <w:left w:type="dxa" w:w="120"/>
+              <w:bottom w:type="dxa" w:w="60"/>
+              <w:right w:type="dxa" w:w="120"/>
+            </w:tcMar>
+          </w:tcPr>
+          <w:p>
+            <w:pPr>
+              <w:jc w:val="center"/>
+            </w:pPr>
+            <w:r>
+              <w:rPr>
+                <w:b w:val="false"/>
+                <w:bCs w:val="false"/>
+                <w:color w:val="000000"/>
+                <w:sz w:val="18"/>
+                <w:szCs w:val="18"/>
+              </w:rPr>
+              <w:t xml:space="preserve">93.9%</w:t>
+            </w:r>
+          </w:p>
+        </w:tc>
+        <w:tc>
+          <w:tcPr>
+            <w:tcW w:type="dxa" w:w="2240"/>
+            <w:tcBorders>
+              <w:top w:val="single" w:color="CCCCCC" w:sz="1"/>
+              <w:left w:val="single" w:color="CCCCCC" w:sz="1"/>
+              <w:bottom w:val="single" w:color="CCCCCC" w:sz="1"/>
+              <w:right w:val="single" w:color="CCCCCC" w:sz="1"/>
+            </w:tcBorders>
+            <w:shd w:fill="FFFFFF" w:val="clear"/>
+            <w:tcMar>
+              <w:top w:type="dxa" w:w="60"/>
+              <w:left w:type="dxa" w:w="120"/>
+              <w:bottom w:type="dxa" w:w="60"/>
+              <w:right w:type="dxa" w:w="120"/>
+            </w:tcMar>
+          </w:tcPr>
+          <w:p>
+            <w:pPr>
+              <w:jc w:val="center"/>
+            </w:pPr>
+            <w:r>
+              <w:rPr>
+                <w:b w:val="false"/>
+                <w:bCs w:val="false"/>
+                <w:color w:val="000000"/>
+                <w:sz w:val="18"/>
+                <w:szCs w:val="18"/>
+              </w:rPr>
+              <w:t xml:space="preserve">93.2%</w:t>
+            </w:r>
+          </w:p>
+        </w:tc>
+        <w:tc>
+          <w:tcPr>
+            <w:tcW w:type="dxa" w:w="2240"/>
+            <w:tcBorders>
+              <w:top w:val="single" w:color="CCCCCC" w:sz="1"/>
+              <w:left w:val="single" w:color="CCCCCC" w:sz="1"/>
+              <w:bottom w:val="single" w:color="CCCCCC" w:sz="1"/>
+              <w:right w:val="single" w:color="CCCCCC" w:sz="1"/>
+            </w:tcBorders>
+            <w:shd w:fill="FFFFFF" w:val="clear"/>
+            <w:tcMar>
+              <w:top w:type="dxa" w:w="60"/>
+              <w:left w:type="dxa" w:w="120"/>
+              <w:bottom w:type="dxa" w:w="60"/>
+              <w:right w:type="dxa" w:w="120"/>
+            </w:tcMar>
+          </w:tcPr>
+          <w:p>
+            <w:pPr>
+              <w:jc w:val="center"/>
+            </w:pPr>
+            <w:r>
+              <w:rPr>
+                <w:b w:val="false"/>
+                <w:bCs w:val="false"/>
+                <w:color w:val="000000"/>
+                <w:sz w:val="18"/>
+                <w:szCs w:val="18"/>
+              </w:rPr>
+              <w:t xml:space="preserve">22.7%</w:t>
+            </w:r>
+          </w:p>
+        </w:tc>
+      </w:tr>
+      <w:tr>
+        <w:tc>
+          <w:tcPr>
+            <w:tcW w:type="dxa" w:w="2640"/>
+            <w:tcBorders>
+              <w:top w:val="single" w:color="CCCCCC" w:sz="1"/>
+              <w:left w:val="single" w:color="CCCCCC" w:sz="1"/>
+              <w:bottom w:val="single" w:color="CCCCCC" w:sz="1"/>
+              <w:right w:val="single" w:color="CCCCCC" w:sz="1"/>
+            </w:tcBorders>
+            <w:shd w:fill="F2F6F9" w:val="clear"/>
+            <w:tcMar>
+              <w:top w:type="dxa" w:w="60"/>
+              <w:left w:type="dxa" w:w="120"/>
+              <w:bottom w:type="dxa" w:w="60"/>
+              <w:right w:type="dxa" w:w="120"/>
+            </w:tcMar>
+          </w:tcPr>
+          <w:p>
+            <w:pPr>
+              <w:jc w:val="left"/>
+            </w:pPr>
+            <w:r>
+              <w:rPr>
+                <w:b w:val="false"/>
+                <w:bCs w:val="false"/>
+                <w:color w:val="000000"/>
+                <w:sz w:val="18"/>
+                <w:szCs w:val="18"/>
+              </w:rPr>
+              <w:t xml:space="preserve">Mindanao</w:t>
+            </w:r>
+          </w:p>
+        </w:tc>
+        <w:tc>
+          <w:tcPr>
+            <w:tcW w:type="dxa" w:w="2240"/>
+            <w:tcBorders>
+              <w:top w:val="single" w:color="CCCCCC" w:sz="1"/>
+              <w:left w:val="single" w:color="CCCCCC" w:sz="1"/>
+              <w:bottom w:val="single" w:color="CCCCCC" w:sz="1"/>
+              <w:right w:val="single" w:color="CCCCCC" w:sz="1"/>
+            </w:tcBorders>
+            <w:shd w:fill="F2F6F9" w:val="clear"/>
+            <w:tcMar>
+              <w:top w:type="dxa" w:w="60"/>
+              <w:left w:type="dxa" w:w="120"/>
+              <w:bottom w:type="dxa" w:w="60"/>
+              <w:right w:type="dxa" w:w="120"/>
+            </w:tcMar>
+          </w:tcPr>
+          <w:p>
+            <w:pPr>
+              <w:jc w:val="center"/>
+            </w:pPr>
+            <w:r>
+              <w:rPr>
+                <w:b w:val="false"/>
+                <w:bCs w:val="false"/>
+                <w:color w:val="000000"/>
+                <w:sz w:val="18"/>
+                <w:szCs w:val="18"/>
+              </w:rPr>
+              <w:t xml:space="preserve">93.8%</w:t>
+            </w:r>
+          </w:p>
+        </w:tc>
+        <w:tc>
+          <w:tcPr>
+            <w:tcW w:type="dxa" w:w="2240"/>
+            <w:tcBorders>
+              <w:top w:val="single" w:color="CCCCCC" w:sz="1"/>
+              <w:left w:val="single" w:color="CCCCCC" w:sz="1"/>
+              <w:bottom w:val="single" w:color="CCCCCC" w:sz="1"/>
+              <w:right w:val="single" w:color="CCCCCC" w:sz="1"/>
+            </w:tcBorders>
+            <w:shd w:fill="F2F6F9" w:val="clear"/>
+            <w:tcMar>
+              <w:top w:type="dxa" w:w="60"/>
+              <w:left w:type="dxa" w:w="120"/>
+              <w:bottom w:type="dxa" w:w="60"/>
+              <w:right w:type="dxa" w:w="120"/>
+            </w:tcMar>
+          </w:tcPr>
+          <w:p>
+            <w:pPr>
+              <w:jc w:val="center"/>
+            </w:pPr>
+            <w:r>
+              <w:rPr>
+                <w:b w:val="false"/>
+                <w:bCs w:val="false"/>
+                <w:color w:val="000000"/>
+                <w:sz w:val="18"/>
+                <w:szCs w:val="18"/>
+              </w:rPr>
+              <w:t xml:space="preserve">91.2%</w:t>
+            </w:r>
+          </w:p>
+        </w:tc>
+        <w:tc>
+          <w:tcPr>
+            <w:tcW w:type="dxa" w:w="2240"/>
+            <w:tcBorders>
+              <w:top w:val="single" w:color="CCCCCC" w:sz="1"/>
+              <w:left w:val="single" w:color="CCCCCC" w:sz="1"/>
+              <w:bottom w:val="single" w:color="CCCCCC" w:sz="1"/>
+              <w:right w:val="single" w:color="CCCCCC" w:sz="1"/>
+            </w:tcBorders>
+            <w:shd w:fill="F2F6F9" w:val="clear"/>
+            <w:tcMar>
+              <w:top w:type="dxa" w:w="60"/>
+              <w:left w:type="dxa" w:w="120"/>
+              <w:bottom w:type="dxa" w:w="60"/>
+              <w:right w:type="dxa" w:w="120"/>
+            </w:tcMar>
+          </w:tcPr>
+          <w:p>
+            <w:pPr>
+              <w:jc w:val="center"/>
+            </w:pPr>
+            <w:r>
+              <w:rPr>
+                <w:b w:val="false"/>
+                <w:bCs w:val="false"/>
+                <w:color w:val="000000"/>
+                <w:sz w:val="18"/>
+                <w:szCs w:val="18"/>
+              </w:rPr>
+              <w:t xml:space="preserve">20.5%</w:t>
+            </w:r>
+          </w:p>
+        </w:tc>
+      </w:tr>
+    </w:tbl>
+    <w:p>
+      <w:pPr>
+        <w:pStyle w:val="Heading2"/>
+      </w:pPr>
+      <w:r>
         <w:t xml:space="preserve">Households read the crisis through the cost of living</w:t>
       </w:r>
     </w:p>
@@ -2585,7 +4352,7 @@
           <w:sz w:val="16"/>
           <w:szCs w:val="16"/>
         </w:rPr>
-        <w:t xml:space="preserve">Listening to the Philippines (L2PHL / Project TIPON) CATI panel, Rounds 6 (n = 1,167) and 7 (n = 993), fielded April–May 2026; crisis-perception questions V13–V18 (Views module). Coping mechanisms are from the shocks module, among households reporting a recent shock (486 responses across the two rounds). Figures are shares of responding households and are unweighted. Survey-weighted estimates and breakdowns by region and income quintile are pending a household crosswalk and will follow in a revised version (v2).</w:t>
+        <w:t xml:space="preserve">Listening to the Philippines (L2PHL / Project TIPON) CATI panel, Rounds 6 (n = 1,167) and 7 (n = 993), fielded April–May 2026; crisis-perception questions V13–V18 (Views module). Coping mechanisms are from the shocks module, among households reporting a recent shock (486 responses across the two rounds). Figures are shares of responding households and are unweighted. Breakdowns by region and income quintile use the household’s barangay: region from the barangay PSGC, and an income quintile from the small-area (barangay-level) S2S imputed per-capita income, matched to 99.3 percent of respondents via the PSGC code. The quintile is therefore a small-area income measure rather than an exact household ranking. Figures are unweighted; survey-weighted estimates will follow in a revised version.</w:t>
       </w:r>
     </w:p>
     <w:sectPr>

</xml_diff>

<commit_message>
crisis note: apply CATI survey weights (hhw) to all figures; 100% weight match
</commit_message>
<xml_diff>
--- a/CATI/Analysis/SL/L2PHL_CATI_MiddleEast_Crisis_Note_Jun2026.docx
+++ b/CATI/Analysis/SL/L2PHL_CATI_MiddleEast_Crisis_Note_Jun2026.docx
@@ -378,7 +378,7 @@
                 <w:sz w:val="18"/>
                 <w:szCs w:val="18"/>
               </w:rPr>
-              <w:t xml:space="preserve">92.5%</w:t>
+              <w:t xml:space="preserve">92.4%</w:t>
             </w:r>
           </w:p>
         </w:tc>
@@ -411,7 +411,7 @@
                 <w:sz w:val="18"/>
                 <w:szCs w:val="18"/>
               </w:rPr>
-              <w:t xml:space="preserve">92.0%</w:t>
+              <w:t xml:space="preserve">92.2%</w:t>
             </w:r>
           </w:p>
         </w:tc>
@@ -444,7 +444,7 @@
                 <w:sz w:val="18"/>
                 <w:szCs w:val="18"/>
               </w:rPr>
-              <w:t xml:space="preserve">−0.5</w:t>
+              <w:t xml:space="preserve">−0.2</w:t>
             </w:r>
           </w:p>
         </w:tc>
@@ -512,7 +512,7 @@
                 <w:sz w:val="18"/>
                 <w:szCs w:val="18"/>
               </w:rPr>
-              <w:t xml:space="preserve">55.4%</w:t>
+              <w:t xml:space="preserve">55.0%</w:t>
             </w:r>
           </w:p>
         </w:tc>
@@ -545,7 +545,7 @@
                 <w:sz w:val="18"/>
                 <w:szCs w:val="18"/>
               </w:rPr>
-              <w:t xml:space="preserve">49.8%</w:t>
+              <w:t xml:space="preserve">49.5%</w:t>
             </w:r>
           </w:p>
         </w:tc>
@@ -578,7 +578,7 @@
                 <w:sz w:val="18"/>
                 <w:szCs w:val="18"/>
               </w:rPr>
-              <w:t xml:space="preserve">−5.7</w:t>
+              <w:t xml:space="preserve">−5.5</w:t>
             </w:r>
           </w:p>
         </w:tc>
@@ -646,7 +646,7 @@
                 <w:sz w:val="18"/>
                 <w:szCs w:val="18"/>
               </w:rPr>
-              <w:t xml:space="preserve">89.2%</w:t>
+              <w:t xml:space="preserve">89.5%</w:t>
             </w:r>
           </w:p>
         </w:tc>
@@ -679,7 +679,7 @@
                 <w:sz w:val="18"/>
                 <w:szCs w:val="18"/>
               </w:rPr>
-              <w:t xml:space="preserve">89.0%</w:t>
+              <w:t xml:space="preserve">88.7%</w:t>
             </w:r>
           </w:p>
         </w:tc>
@@ -712,7 +712,7 @@
                 <w:sz w:val="18"/>
                 <w:szCs w:val="18"/>
               </w:rPr>
-              <w:t xml:space="preserve">−0.2</w:t>
+              <w:t xml:space="preserve">−0.8</w:t>
             </w:r>
           </w:p>
         </w:tc>
@@ -780,7 +780,7 @@
                 <w:sz w:val="18"/>
                 <w:szCs w:val="18"/>
               </w:rPr>
-              <w:t xml:space="preserve">69.3%</w:t>
+              <w:t xml:space="preserve">69.6%</w:t>
             </w:r>
           </w:p>
         </w:tc>
@@ -813,7 +813,7 @@
                 <w:sz w:val="18"/>
                 <w:szCs w:val="18"/>
               </w:rPr>
-              <w:t xml:space="preserve">65.2%</w:t>
+              <w:t xml:space="preserve">64.5%</w:t>
             </w:r>
           </w:p>
         </w:tc>
@@ -846,7 +846,7 @@
                 <w:sz w:val="18"/>
                 <w:szCs w:val="18"/>
               </w:rPr>
-              <w:t xml:space="preserve">−4.2</w:t>
+              <w:t xml:space="preserve">−5.1</w:t>
             </w:r>
           </w:p>
         </w:tc>
@@ -914,7 +914,7 @@
                 <w:sz w:val="18"/>
                 <w:szCs w:val="18"/>
               </w:rPr>
-              <w:t xml:space="preserve">86.9%</w:t>
+              <w:t xml:space="preserve">87.0%</w:t>
             </w:r>
           </w:p>
         </w:tc>
@@ -980,7 +980,7 @@
                 <w:sz w:val="18"/>
                 <w:szCs w:val="18"/>
               </w:rPr>
-              <w:t xml:space="preserve">−1.7</w:t>
+              <w:t xml:space="preserve">−1.8</w:t>
             </w:r>
           </w:p>
         </w:tc>
@@ -1048,7 +1048,7 @@
                 <w:sz w:val="18"/>
                 <w:szCs w:val="18"/>
               </w:rPr>
-              <w:t xml:space="preserve">80.0%</w:t>
+              <w:t xml:space="preserve">79.4%</w:t>
             </w:r>
           </w:p>
         </w:tc>
@@ -1081,7 +1081,7 @@
                 <w:sz w:val="18"/>
                 <w:szCs w:val="18"/>
               </w:rPr>
-              <w:t xml:space="preserve">68.0%</w:t>
+              <w:t xml:space="preserve">67.9%</w:t>
             </w:r>
           </w:p>
         </w:tc>
@@ -1114,7 +1114,7 @@
                 <w:sz w:val="18"/>
                 <w:szCs w:val="18"/>
               </w:rPr>
-              <w:t xml:space="preserve">−12.1</w:t>
+              <w:t xml:space="preserve">−11.5</w:t>
             </w:r>
           </w:p>
         </w:tc>
@@ -1182,7 +1182,7 @@
                 <w:sz w:val="18"/>
                 <w:szCs w:val="18"/>
               </w:rPr>
-              <w:t xml:space="preserve">49.3%</w:t>
+              <w:t xml:space="preserve">48.9%</w:t>
             </w:r>
           </w:p>
         </w:tc>
@@ -1215,7 +1215,7 @@
                 <w:sz w:val="18"/>
                 <w:szCs w:val="18"/>
               </w:rPr>
-              <w:t xml:space="preserve">45.7%</w:t>
+              <w:t xml:space="preserve">44.8%</w:t>
             </w:r>
           </w:p>
         </w:tc>
@@ -1248,7 +1248,7 @@
                 <w:sz w:val="18"/>
                 <w:szCs w:val="18"/>
               </w:rPr>
-              <w:t xml:space="preserve">−3.6</w:t>
+              <w:t xml:space="preserve">−4.1</w:t>
             </w:r>
           </w:p>
         </w:tc>
@@ -1316,7 +1316,7 @@
                 <w:sz w:val="18"/>
                 <w:szCs w:val="18"/>
               </w:rPr>
-              <w:t xml:space="preserve">24.6%</w:t>
+              <w:t xml:space="preserve">24.4%</w:t>
             </w:r>
           </w:p>
         </w:tc>
@@ -1349,7 +1349,7 @@
                 <w:sz w:val="18"/>
                 <w:szCs w:val="18"/>
               </w:rPr>
-              <w:t xml:space="preserve">25.5%</w:t>
+              <w:t xml:space="preserve">26.1%</w:t>
             </w:r>
           </w:p>
         </w:tc>
@@ -1382,7 +1382,7 @@
                 <w:sz w:val="18"/>
                 <w:szCs w:val="18"/>
               </w:rPr>
-              <w:t xml:space="preserve">+0.9</w:t>
+              <w:t xml:space="preserve">+1.7</w:t>
             </w:r>
           </w:p>
         </w:tc>
@@ -1435,7 +1435,7 @@
           <w:sz w:val="20"/>
           <w:szCs w:val="20"/>
         </w:rPr>
-        <w:t xml:space="preserve">Concern barely varies from the poorest to the richest fifth of households (94.0 percent in the bottom income quintile, 91.2 percent in the top), and the same flatness holds for perceived impact and expected inflation. A Middle East price shock is read as a near-universal cost-of-living concern rather than a problem confined to poorer households, and confidence in the government response is uniformly low across quintiles, between about 21 and 31 percent.</w:t>
+        <w:t xml:space="preserve">Concern barely varies from the poorest to the richest fifth of households (94.0 percent in the bottom income quintile, 91.8 percent in the top), and the same flatness holds for perceived impact and expected inflation. A Middle East price shock is read as a near-universal cost-of-living concern rather than a problem confined to poorer households, and confidence in the government response is uniformly low across quintiles, between about 21 and 31 percent.</w:t>
       </w:r>
     </w:p>
     <w:tbl>
@@ -1723,7 +1723,7 @@
                 <w:sz w:val="18"/>
                 <w:szCs w:val="18"/>
               </w:rPr>
-              <w:t xml:space="preserve">91.8%</w:t>
+              <w:t xml:space="preserve">91.5%</w:t>
             </w:r>
           </w:p>
         </w:tc>
@@ -1756,7 +1756,7 @@
                 <w:sz w:val="18"/>
                 <w:szCs w:val="18"/>
               </w:rPr>
-              <w:t xml:space="preserve">71.1%</w:t>
+              <w:t xml:space="preserve">69.6%</w:t>
             </w:r>
           </w:p>
         </w:tc>
@@ -1789,7 +1789,7 @@
                 <w:sz w:val="18"/>
                 <w:szCs w:val="18"/>
               </w:rPr>
-              <w:t xml:space="preserve">23.6%</w:t>
+              <w:t xml:space="preserve">23.9%</w:t>
             </w:r>
           </w:p>
         </w:tc>
@@ -1857,7 +1857,7 @@
                 <w:sz w:val="18"/>
                 <w:szCs w:val="18"/>
               </w:rPr>
-              <w:t xml:space="preserve">93.2%</w:t>
+              <w:t xml:space="preserve">92.6%</w:t>
             </w:r>
           </w:p>
         </w:tc>
@@ -1890,7 +1890,7 @@
                 <w:sz w:val="18"/>
                 <w:szCs w:val="18"/>
               </w:rPr>
-              <w:t xml:space="preserve">92.1%</w:t>
+              <w:t xml:space="preserve">92.4%</w:t>
             </w:r>
           </w:p>
         </w:tc>
@@ -1923,7 +1923,7 @@
                 <w:sz w:val="18"/>
                 <w:szCs w:val="18"/>
               </w:rPr>
-              <w:t xml:space="preserve">74.0%</w:t>
+              <w:t xml:space="preserve">74.3%</w:t>
             </w:r>
           </w:p>
         </w:tc>
@@ -1956,7 +1956,7 @@
                 <w:sz w:val="18"/>
                 <w:szCs w:val="18"/>
               </w:rPr>
-              <w:t xml:space="preserve">25.0%</w:t>
+              <w:t xml:space="preserve">26.3%</w:t>
             </w:r>
           </w:p>
         </w:tc>
@@ -2024,7 +2024,7 @@
                 <w:sz w:val="18"/>
                 <w:szCs w:val="18"/>
               </w:rPr>
-              <w:t xml:space="preserve">92.1%</w:t>
+              <w:t xml:space="preserve">92.2%</w:t>
             </w:r>
           </w:p>
         </w:tc>
@@ -2057,7 +2057,7 @@
                 <w:sz w:val="18"/>
                 <w:szCs w:val="18"/>
               </w:rPr>
-              <w:t xml:space="preserve">90.2%</w:t>
+              <w:t xml:space="preserve">89.9%</w:t>
             </w:r>
           </w:p>
         </w:tc>
@@ -2090,7 +2090,7 @@
                 <w:sz w:val="18"/>
                 <w:szCs w:val="18"/>
               </w:rPr>
-              <w:t xml:space="preserve">72.0%</w:t>
+              <w:t xml:space="preserve">70.3%</w:t>
             </w:r>
           </w:p>
         </w:tc>
@@ -2123,7 +2123,7 @@
                 <w:sz w:val="18"/>
                 <w:szCs w:val="18"/>
               </w:rPr>
-              <w:t xml:space="preserve">30.8%</w:t>
+              <w:t xml:space="preserve">30.6%</w:t>
             </w:r>
           </w:p>
         </w:tc>
@@ -2191,7 +2191,7 @@
                 <w:sz w:val="18"/>
                 <w:szCs w:val="18"/>
               </w:rPr>
-              <w:t xml:space="preserve">94.3%</w:t>
+              <w:t xml:space="preserve">94.1%</w:t>
             </w:r>
           </w:p>
         </w:tc>
@@ -2224,7 +2224,7 @@
                 <w:sz w:val="18"/>
                 <w:szCs w:val="18"/>
               </w:rPr>
-              <w:t xml:space="preserve">90.9%</w:t>
+              <w:t xml:space="preserve">90.8%</w:t>
             </w:r>
           </w:p>
         </w:tc>
@@ -2257,7 +2257,7 @@
                 <w:sz w:val="18"/>
                 <w:szCs w:val="18"/>
               </w:rPr>
-              <w:t xml:space="preserve">78.7%</w:t>
+              <w:t xml:space="preserve">78.5%</w:t>
             </w:r>
           </w:p>
         </w:tc>
@@ -2358,7 +2358,7 @@
                 <w:sz w:val="18"/>
                 <w:szCs w:val="18"/>
               </w:rPr>
-              <w:t xml:space="preserve">91.2%</w:t>
+              <w:t xml:space="preserve">91.8%</w:t>
             </w:r>
           </w:p>
         </w:tc>
@@ -2391,7 +2391,7 @@
                 <w:sz w:val="18"/>
                 <w:szCs w:val="18"/>
               </w:rPr>
-              <w:t xml:space="preserve">89.3%</w:t>
+              <w:t xml:space="preserve">89.4%</w:t>
             </w:r>
           </w:p>
         </w:tc>
@@ -2424,7 +2424,7 @@
                 <w:sz w:val="18"/>
                 <w:szCs w:val="18"/>
               </w:rPr>
-              <w:t xml:space="preserve">76.0%</w:t>
+              <w:t xml:space="preserve">75.1%</w:t>
             </w:r>
           </w:p>
         </w:tc>
@@ -2457,7 +2457,7 @@
                 <w:sz w:val="18"/>
                 <w:szCs w:val="18"/>
               </w:rPr>
-              <w:t xml:space="preserve">25.5%</w:t>
+              <w:t xml:space="preserve">24.4%</w:t>
             </w:r>
           </w:p>
         </w:tc>
@@ -2481,7 +2481,7 @@
           <w:sz w:val="20"/>
           <w:szCs w:val="20"/>
         </w:rPr>
-        <w:t xml:space="preserve">It is marginally lower in the National Capital Region (90.6 percent) than in the rest of Luzon, the Visayas, and Mindanao (around 93–94 percent). Confidence that the government is doing enough is lowest in the Visayas (22.7 percent) and Mindanao (20.5 percent).</w:t>
+        <w:t xml:space="preserve">It is marginally lower in the National Capital Region (90.6 percent) than in the rest of Luzon, the Visayas, and Mindanao (around 93–94 percent). Confidence that the government is doing enough is lowest in the Visayas (23.2 percent) and Mindanao (20.7 percent).</w:t>
       </w:r>
     </w:p>
     <w:tbl>
@@ -2735,7 +2735,7 @@
                 <w:sz w:val="18"/>
                 <w:szCs w:val="18"/>
               </w:rPr>
-              <w:t xml:space="preserve">90.1%</w:t>
+              <w:t xml:space="preserve">89.8%</w:t>
             </w:r>
           </w:p>
         </w:tc>
@@ -2768,7 +2768,7 @@
                 <w:sz w:val="18"/>
                 <w:szCs w:val="18"/>
               </w:rPr>
-              <w:t xml:space="preserve">26.7%</w:t>
+              <w:t xml:space="preserve">25.8%</w:t>
             </w:r>
           </w:p>
         </w:tc>
@@ -2836,7 +2836,7 @@
                 <w:sz w:val="18"/>
                 <w:szCs w:val="18"/>
               </w:rPr>
-              <w:t xml:space="preserve">93.0%</w:t>
+              <w:t xml:space="preserve">93.1%</w:t>
             </w:r>
           </w:p>
         </w:tc>
@@ -2869,7 +2869,7 @@
                 <w:sz w:val="18"/>
                 <w:szCs w:val="18"/>
               </w:rPr>
-              <w:t xml:space="preserve">89.9%</w:t>
+              <w:t xml:space="preserve">90.0%</w:t>
             </w:r>
           </w:p>
         </w:tc>
@@ -2902,7 +2902,7 @@
                 <w:sz w:val="18"/>
                 <w:szCs w:val="18"/>
               </w:rPr>
-              <w:t xml:space="preserve">28.5%</w:t>
+              <w:t xml:space="preserve">28.2%</w:t>
             </w:r>
           </w:p>
         </w:tc>
@@ -2970,7 +2970,7 @@
                 <w:sz w:val="18"/>
                 <w:szCs w:val="18"/>
               </w:rPr>
-              <w:t xml:space="preserve">93.9%</w:t>
+              <w:t xml:space="preserve">93.5%</w:t>
             </w:r>
           </w:p>
         </w:tc>
@@ -3003,7 +3003,7 @@
                 <w:sz w:val="18"/>
                 <w:szCs w:val="18"/>
               </w:rPr>
-              <w:t xml:space="preserve">93.2%</w:t>
+              <w:t xml:space="preserve">92.6%</w:t>
             </w:r>
           </w:p>
         </w:tc>
@@ -3036,7 +3036,7 @@
                 <w:sz w:val="18"/>
                 <w:szCs w:val="18"/>
               </w:rPr>
-              <w:t xml:space="preserve">22.7%</w:t>
+              <w:t xml:space="preserve">23.2%</w:t>
             </w:r>
           </w:p>
         </w:tc>
@@ -3104,7 +3104,7 @@
                 <w:sz w:val="18"/>
                 <w:szCs w:val="18"/>
               </w:rPr>
-              <w:t xml:space="preserve">93.8%</w:t>
+              <w:t xml:space="preserve">93.6%</w:t>
             </w:r>
           </w:p>
         </w:tc>
@@ -3170,7 +3170,7 @@
                 <w:sz w:val="18"/>
                 <w:szCs w:val="18"/>
               </w:rPr>
-              <w:t xml:space="preserve">20.5%</w:t>
+              <w:t xml:space="preserve">20.7%</w:t>
             </w:r>
           </w:p>
         </w:tc>
@@ -3346,7 +3346,7 @@
                 <w:sz w:val="18"/>
                 <w:szCs w:val="18"/>
               </w:rPr>
-              <w:t xml:space="preserve">35.3%</w:t>
+              <w:t xml:space="preserve">35.2%</w:t>
             </w:r>
           </w:p>
         </w:tc>
@@ -3414,7 +3414,7 @@
                 <w:sz w:val="18"/>
                 <w:szCs w:val="18"/>
               </w:rPr>
-              <w:t xml:space="preserve">34.1%</w:t>
+              <w:t xml:space="preserve">34.4%</w:t>
             </w:r>
           </w:p>
         </w:tc>
@@ -3482,7 +3482,7 @@
                 <w:sz w:val="18"/>
                 <w:szCs w:val="18"/>
               </w:rPr>
-              <w:t xml:space="preserve">19.7%</w:t>
+              <w:t xml:space="preserve">19.9%</w:t>
             </w:r>
           </w:p>
         </w:tc>
@@ -3550,7 +3550,7 @@
                 <w:sz w:val="18"/>
                 <w:szCs w:val="18"/>
               </w:rPr>
-              <w:t xml:space="preserve">1.3%</w:t>
+              <w:t xml:space="preserve">1.1%</w:t>
             </w:r>
           </w:p>
         </w:tc>
@@ -3618,7 +3618,7 @@
                 <w:sz w:val="18"/>
                 <w:szCs w:val="18"/>
               </w:rPr>
-              <w:t xml:space="preserve">0.3%</w:t>
+              <w:t xml:space="preserve">0.1%</w:t>
             </w:r>
           </w:p>
         </w:tc>
@@ -4352,7 +4352,7 @@
           <w:sz w:val="16"/>
           <w:szCs w:val="16"/>
         </w:rPr>
-        <w:t xml:space="preserve">Listening to the Philippines (L2PHL / Project TIPON) CATI panel, Rounds 6 (n = 1,167) and 7 (n = 993), fielded April–May 2026; crisis-perception questions V13–V18 (Views module). Coping mechanisms are from the shocks module, among households reporting a recent shock (486 responses across the two rounds). Figures are shares of responding households and are unweighted. Breakdowns by region and income quintile use the household’s barangay: region from the barangay PSGC, and an income quintile from the small-area (barangay-level) S2S imputed per-capita income, matched to 99.3 percent of respondents via the PSGC code. The quintile is therefore a small-area income measure rather than an exact household ranking. Figures are unweighted; survey-weighted estimates will follow in a revised version.</w:t>
+        <w:t xml:space="preserve">Listening to the Philippines (L2PHL / Project TIPON) CATI panel, Rounds 6 (n = 1,167) and 7 (n = 993), fielded April–May 2026; crisis-perception questions V13–V18 (Views module). Coping mechanisms are from the shocks module, among households reporting a recent shock (486 responses across the two rounds). Figures are survey-weighted shares of households using the CATI panel household weights (hhw); the coping figures are unweighted. Breakdowns by region and income quintile use the household’s barangay: region from the barangay PSGC, and an income quintile from the small-area (barangay-level) S2S imputed per-capita income, matched to 99.3 percent of respondents via the PSGC code. The quintile is therefore a small-area income measure rather than an exact household ranking.</w:t>
       </w:r>
     </w:p>
     <w:sectPr>

</xml_diff>